<commit_message>
fix: add commune's CP to various places
- SV/SSA/TIAC's CSV export
- SV/SSA/TIAC's docx export
- SV's detail view (summary)
- TIAC's emails
</commit_message>
<xml_diff>
--- a/ssa/doc_templates/evenement_produit.docx
+++ b/ssa/doc_templates/evenement_produit.docx
@@ -1,10 +1,10 @@
 
 <file path=word/document.xml><?xml version="1.0" encoding="utf-8"?>
-<w:document xmlns:o="urn:schemas-microsoft-com:office:office" xmlns:r="http://schemas.openxmlformats.org/officeDocument/2006/relationships" xmlns:v="urn:schemas-microsoft-com:vml" xmlns:w="http://schemas.openxmlformats.org/wordprocessingml/2006/main" xmlns:w10="urn:schemas-microsoft-com:office:word" xmlns:wp="http://schemas.openxmlformats.org/drawingml/2006/wordprocessingDrawing" xmlns:wps="http://schemas.microsoft.com/office/word/2010/wordprocessingShape" xmlns:wpg="http://schemas.microsoft.com/office/word/2010/wordprocessingGroup" xmlns:mc="http://schemas.openxmlformats.org/markup-compatibility/2006" xmlns:wp14="http://schemas.microsoft.com/office/word/2010/wordprocessingDrawing" xmlns:w14="http://schemas.microsoft.com/office/word/2010/wordml" xmlns:w15="http://schemas.microsoft.com/office/word/2012/wordml" mc:Ignorable="w14 wp14 w15">
+<w:document xmlns:o="urn:schemas-microsoft-com:office:office" xmlns:r="http://schemas.openxmlformats.org/officeDocument/2006/relationships" xmlns:v="urn:schemas-microsoft-com:vml" xmlns:w="http://schemas.openxmlformats.org/wordprocessingml/2006/main" xmlns:w10="urn:schemas-microsoft-com:office:word" xmlns:wp="http://schemas.openxmlformats.org/drawingml/2006/wordprocessingDrawing" xmlns:pic="http://schemas.openxmlformats.org/drawingml/2006/picture" xmlns:wps="http://schemas.microsoft.com/office/word/2010/wordprocessingShape" xmlns:wpg="http://schemas.microsoft.com/office/word/2010/wordprocessingGroup" xmlns:mc="http://schemas.openxmlformats.org/markup-compatibility/2006" xmlns:wp14="http://schemas.microsoft.com/office/word/2010/wordprocessingDrawing" xmlns:w14="http://schemas.microsoft.com/office/word/2010/wordml" xmlns:w15="http://schemas.microsoft.com/office/word/2012/wordml" mc:Ignorable="w14 wp14 w15">
   <w:body>
     <w:p>
       <w:pPr>
-        <w:pStyle w:val="Titre1"/>
+        <w:pStyle w:val="Heading1"/>
         <w:numPr>
           <w:ilvl w:val="0"/>
           <w:numId w:val="2"/>
@@ -12,47 +12,23 @@
         <w:spacing w:before="240" w:after="120"/>
         <w:jc w:val="center"/>
         <w:rPr>
-          <w:rFonts w:ascii="Calibri" w:hAnsi="Calibri" w:cs="Calibri" w:asciiTheme="minorHAnsi" w:cstheme="minorHAnsi" w:hAnsiTheme="minorHAnsi"/>
+          <w:rFonts w:cs="" w:asciiTheme="minorHAnsi" w:cstheme="minorHAnsi" w:hAnsiTheme="minorHAnsi"/>
           <w:sz w:val="28"/>
           <w:szCs w:val="28"/>
         </w:rPr>
       </w:pPr>
       <w:r>
         <w:rPr>
-          <w:rFonts w:cs="Calibri" w:ascii="Calibri" w:hAnsi="Calibri" w:asciiTheme="minorHAnsi" w:cstheme="minorHAnsi" w:hAnsiTheme="minorHAnsi"/>
+          <w:rFonts w:cs="" w:asciiTheme="minorHAnsi" w:cstheme="minorHAnsi" w:hAnsiTheme="minorHAnsi"/>
           <w:sz w:val="28"/>
           <w:szCs w:val="28"/>
         </w:rPr>
-        <w:t xml:space="preserve">SEVES – </w:t>
-      </w:r>
-      <w:r>
-        <w:rPr>
-          <w:rFonts w:cs="Calibri" w:ascii="Calibri" w:hAnsi="Calibri" w:asciiTheme="minorHAnsi" w:cstheme="minorHAnsi" w:hAnsiTheme="minorHAnsi"/>
-          <w:sz w:val="28"/>
-          <w:szCs w:val="28"/>
-        </w:rPr>
-        <w:t>Alimentaire</w:t>
-      </w:r>
-      <w:r>
-        <w:rPr>
-          <w:rFonts w:cs="Calibri" w:ascii="Calibri" w:hAnsi="Calibri" w:asciiTheme="minorHAnsi" w:cstheme="minorHAnsi" w:hAnsiTheme="minorHAnsi"/>
-          <w:sz w:val="28"/>
-          <w:szCs w:val="28"/>
-        </w:rPr>
-        <w:t xml:space="preserve"> – </w:t>
-      </w:r>
-      <w:r>
-        <w:rPr>
-          <w:rFonts w:cs="Calibri" w:ascii="Calibri" w:hAnsi="Calibri" w:asciiTheme="minorHAnsi" w:cstheme="minorHAnsi" w:hAnsiTheme="minorHAnsi"/>
-          <w:sz w:val="28"/>
-          <w:szCs w:val="28"/>
-        </w:rPr>
-        <w:t>Évènement produit</w:t>
-      </w:r>
-    </w:p>
-    <w:p>
-      <w:pPr>
-        <w:pStyle w:val="Titre1"/>
+        <w:t>SEVES – Alimentaire – Évènement produit</w:t>
+      </w:r>
+    </w:p>
+    <w:p>
+      <w:pPr>
+        <w:pStyle w:val="Heading1"/>
         <w:numPr>
           <w:ilvl w:val="0"/>
           <w:numId w:val="2"/>
@@ -61,14 +37,14 @@
         <w:spacing w:before="240" w:after="120"/>
         <w:jc w:val="center"/>
         <w:rPr>
-          <w:rFonts w:ascii="Calibri" w:hAnsi="Calibri" w:cs="Calibri" w:asciiTheme="minorHAnsi" w:cstheme="minorHAnsi" w:hAnsiTheme="minorHAnsi"/>
+          <w:rFonts w:cs="" w:asciiTheme="minorHAnsi" w:cstheme="minorHAnsi" w:hAnsiTheme="minorHAnsi"/>
           <w:sz w:val="28"/>
           <w:szCs w:val="28"/>
         </w:rPr>
       </w:pPr>
       <w:r>
         <w:rPr>
-          <w:rFonts w:cs="Calibri" w:ascii="Calibri" w:hAnsi="Calibri" w:asciiTheme="minorHAnsi" w:cstheme="minorHAnsi" w:hAnsiTheme="minorHAnsi"/>
+          <w:rFonts w:cs="" w:asciiTheme="minorHAnsi" w:cstheme="minorHAnsi" w:hAnsiTheme="minorHAnsi"/>
           <w:sz w:val="28"/>
           <w:szCs w:val="28"/>
         </w:rPr>
@@ -77,19 +53,19 @@
     </w:p>
     <w:p>
       <w:pPr>
-        <w:pStyle w:val="Corpsdetexte"/>
+        <w:pStyle w:val="BodyText"/>
         <w:bidi w:val="0"/>
         <w:spacing w:before="240" w:after="120"/>
         <w:jc w:val="center"/>
         <w:rPr>
-          <w:rFonts w:ascii="Calibri" w:hAnsi="Calibri" w:cs="Calibri" w:asciiTheme="minorHAnsi" w:cstheme="minorHAnsi" w:hAnsiTheme="minorHAnsi"/>
+          <w:rFonts w:cs="" w:asciiTheme="minorHAnsi" w:cstheme="minorHAnsi" w:hAnsiTheme="minorHAnsi"/>
           <w:sz w:val="16"/>
           <w:szCs w:val="16"/>
         </w:rPr>
       </w:pPr>
       <w:r>
         <w:rPr>
-          <w:rFonts w:cs="Calibri" w:ascii="Calibri" w:hAnsi="Calibri" w:cstheme="minorHAnsi"/>
+          <w:rFonts w:cs="" w:ascii="Calibri" w:hAnsi="Calibri" w:cstheme="minorHAnsi"/>
           <w:sz w:val="16"/>
           <w:szCs w:val="16"/>
         </w:rPr>
@@ -98,7 +74,7 @@
     </w:p>
     <w:p>
       <w:pPr>
-        <w:pStyle w:val="Corpsdetexte"/>
+        <w:pStyle w:val="BodyText"/>
         <w:bidi w:val="0"/>
         <w:jc w:val="center"/>
         <w:rPr/>
@@ -109,7 +85,7 @@
     </w:p>
     <w:p>
       <w:pPr>
-        <w:pStyle w:val="Titre4"/>
+        <w:pStyle w:val="Heading4"/>
         <w:numPr>
           <w:ilvl w:val="3"/>
           <w:numId w:val="2"/>
@@ -125,7 +101,7 @@
     </w:p>
     <w:p>
       <w:pPr>
-        <w:pStyle w:val="Lignehorizontale"/>
+        <w:pStyle w:val="Lignehorizontaleuser"/>
         <w:suppressLineNumbers/>
         <w:pBdr>
           <w:bottom w:val="double" w:sz="2" w:space="0" w:color="808080"/>
@@ -141,7 +117,7 @@
     </w:p>
     <w:p>
       <w:pPr>
-        <w:pStyle w:val="Corpsdetexte"/>
+        <w:pStyle w:val="BodyText"/>
         <w:bidi w:val="0"/>
         <w:jc w:val="left"/>
         <w:rPr/>
@@ -153,7 +129,7 @@
     </w:p>
     <w:p>
       <w:pPr>
-        <w:pStyle w:val="Corpsdetexte"/>
+        <w:pStyle w:val="BodyText"/>
         <w:bidi w:val="0"/>
         <w:jc w:val="left"/>
         <w:rPr/>
@@ -165,7 +141,7 @@
     </w:p>
     <w:p>
       <w:pPr>
-        <w:pStyle w:val="Corpsdetexte"/>
+        <w:pStyle w:val="BodyText"/>
         <w:bidi w:val="0"/>
         <w:jc w:val="left"/>
         <w:rPr/>
@@ -177,7 +153,7 @@
     </w:p>
     <w:p>
       <w:pPr>
-        <w:pStyle w:val="Corpsdetexte"/>
+        <w:pStyle w:val="BodyText"/>
         <w:bidi w:val="0"/>
         <w:jc w:val="left"/>
         <w:rPr/>
@@ -188,7 +164,7 @@
       </w:r>
       <w:r>
         <w:rPr>
-          <w:rFonts w:cs="Calibri" w:ascii="Calibri" w:hAnsi="Calibri" w:asciiTheme="minorHAnsi" w:cstheme="minorHAnsi" w:hAnsiTheme="minorHAnsi"/>
+          <w:rFonts w:cs="" w:asciiTheme="minorHAnsi" w:cstheme="minorHAnsi" w:hAnsiTheme="minorHAnsi"/>
           <w:sz w:val="20"/>
           <w:szCs w:val="20"/>
         </w:rPr>
@@ -201,7 +177,7 @@
     </w:p>
     <w:p>
       <w:pPr>
-        <w:pStyle w:val="Corpsdetexte"/>
+        <w:pStyle w:val="BodyText"/>
         <w:bidi w:val="0"/>
         <w:jc w:val="left"/>
         <w:rPr/>
@@ -212,7 +188,7 @@
       </w:r>
       <w:r>
         <w:rPr>
-          <w:rFonts w:cs="Calibri" w:ascii="Calibri" w:hAnsi="Calibri" w:asciiTheme="minorHAnsi" w:cstheme="minorHAnsi" w:hAnsiTheme="minorHAnsi"/>
+          <w:rFonts w:cs="" w:asciiTheme="minorHAnsi" w:cstheme="minorHAnsi" w:hAnsiTheme="minorHAnsi"/>
           <w:sz w:val="20"/>
           <w:szCs w:val="20"/>
         </w:rPr>
@@ -225,7 +201,7 @@
     </w:p>
     <w:p>
       <w:pPr>
-        <w:pStyle w:val="Corpsdetexte"/>
+        <w:pStyle w:val="BodyText"/>
         <w:bidi w:val="0"/>
         <w:jc w:val="left"/>
         <w:rPr/>
@@ -236,7 +212,7 @@
       </w:r>
       <w:r>
         <w:rPr>
-          <w:rFonts w:cs="Calibri" w:ascii="Calibri" w:hAnsi="Calibri" w:asciiTheme="minorHAnsi" w:cstheme="minorHAnsi" w:hAnsiTheme="minorHAnsi"/>
+          <w:rFonts w:cs="" w:asciiTheme="minorHAnsi" w:cstheme="minorHAnsi" w:hAnsiTheme="minorHAnsi"/>
           <w:sz w:val="20"/>
           <w:szCs w:val="20"/>
         </w:rPr>
@@ -249,7 +225,7 @@
     </w:p>
     <w:p>
       <w:pPr>
-        <w:pStyle w:val="Corpsdetexte"/>
+        <w:pStyle w:val="BodyText"/>
         <w:bidi w:val="0"/>
         <w:jc w:val="left"/>
         <w:rPr/>
@@ -260,7 +236,7 @@
       </w:r>
       <w:r>
         <w:rPr>
-          <w:rFonts w:cs="Calibri" w:ascii="Calibri" w:hAnsi="Calibri" w:asciiTheme="minorHAnsi" w:cstheme="minorHAnsi" w:hAnsiTheme="minorHAnsi"/>
+          <w:rFonts w:cs="" w:asciiTheme="minorHAnsi" w:cstheme="minorHAnsi" w:hAnsiTheme="minorHAnsi"/>
           <w:sz w:val="20"/>
           <w:szCs w:val="20"/>
         </w:rPr>
@@ -273,7 +249,7 @@
     </w:p>
     <w:p>
       <w:pPr>
-        <w:pStyle w:val="Corpsdetexte"/>
+        <w:pStyle w:val="BodyText"/>
         <w:bidi w:val="0"/>
         <w:jc w:val="left"/>
         <w:rPr/>
@@ -313,7 +289,7 @@
           </w:tcPr>
           <w:p>
             <w:pPr>
-              <w:pStyle w:val="Corpsdetexte"/>
+              <w:pStyle w:val="BodyText"/>
               <w:bidi w:val="0"/>
               <w:spacing w:before="0" w:after="140"/>
               <w:jc w:val="left"/>
@@ -325,7 +301,7 @@
             </w:r>
             <w:r>
               <w:rPr>
-                <w:rFonts w:cs="Calibri" w:ascii="Calibri" w:hAnsi="Calibri" w:asciiTheme="minorHAnsi" w:cstheme="minorHAnsi" w:hAnsiTheme="minorHAnsi"/>
+                <w:rFonts w:cs="" w:asciiTheme="minorHAnsi" w:cstheme="minorHAnsi" w:hAnsiTheme="minorHAnsi"/>
                 <w:sz w:val="20"/>
                 <w:szCs w:val="20"/>
               </w:rPr>
@@ -341,18 +317,18 @@
     </w:tbl>
     <w:p>
       <w:pPr>
-        <w:pStyle w:val="Corpsdetexte"/>
-        <w:bidi w:val="0"/>
-        <w:jc w:val="left"/>
-        <w:rPr/>
-      </w:pPr>
-      <w:r>
-        <w:rPr/>
-      </w:r>
-    </w:p>
-    <w:p>
-      <w:pPr>
-        <w:pStyle w:val="Titre4"/>
+        <w:pStyle w:val="BodyText"/>
+        <w:bidi w:val="0"/>
+        <w:jc w:val="left"/>
+        <w:rPr/>
+      </w:pPr>
+      <w:r>
+        <w:rPr/>
+      </w:r>
+    </w:p>
+    <w:p>
+      <w:pPr>
+        <w:pStyle w:val="Heading4"/>
         <w:numPr>
           <w:ilvl w:val="3"/>
           <w:numId w:val="2"/>
@@ -368,18 +344,18 @@
     </w:p>
     <w:p>
       <w:pPr>
-        <w:pStyle w:val="Lignehorizontale"/>
-        <w:bidi w:val="0"/>
-        <w:jc w:val="left"/>
-        <w:rPr/>
-      </w:pPr>
-      <w:r>
-        <w:rPr/>
-      </w:r>
-    </w:p>
-    <w:p>
-      <w:pPr>
-        <w:pStyle w:val="Corpsdetexte"/>
+        <w:pStyle w:val="Lignehorizontaleuser"/>
+        <w:bidi w:val="0"/>
+        <w:jc w:val="left"/>
+        <w:rPr/>
+      </w:pPr>
+      <w:r>
+        <w:rPr/>
+      </w:r>
+    </w:p>
+    <w:p>
+      <w:pPr>
+        <w:pStyle w:val="BodyText"/>
         <w:bidi w:val="0"/>
         <w:spacing w:before="0" w:after="140"/>
         <w:jc w:val="left"/>
@@ -391,7 +367,7 @@
       </w:r>
       <w:r>
         <w:rPr>
-          <w:rFonts w:cs="Calibri" w:ascii="Calibri" w:hAnsi="Calibri" w:asciiTheme="minorHAnsi" w:cstheme="minorHAnsi" w:hAnsiTheme="minorHAnsi"/>
+          <w:rFonts w:cs="" w:asciiTheme="minorHAnsi" w:cstheme="minorHAnsi" w:hAnsiTheme="minorHAnsi"/>
           <w:sz w:val="20"/>
           <w:szCs w:val="20"/>
         </w:rPr>
@@ -404,7 +380,7 @@
     </w:p>
     <w:p>
       <w:pPr>
-        <w:pStyle w:val="Corpsdetexte"/>
+        <w:pStyle w:val="BodyText"/>
         <w:bidi w:val="0"/>
         <w:spacing w:before="0" w:after="140"/>
         <w:jc w:val="left"/>
@@ -416,7 +392,7 @@
       </w:r>
       <w:r>
         <w:rPr>
-          <w:rFonts w:cs="Calibri" w:ascii="Calibri" w:hAnsi="Calibri" w:asciiTheme="minorHAnsi" w:cstheme="minorHAnsi" w:hAnsiTheme="minorHAnsi"/>
+          <w:rFonts w:cs="" w:asciiTheme="minorHAnsi" w:cstheme="minorHAnsi" w:hAnsiTheme="minorHAnsi"/>
           <w:sz w:val="20"/>
           <w:szCs w:val="20"/>
         </w:rPr>
@@ -429,7 +405,7 @@
     </w:p>
     <w:p>
       <w:pPr>
-        <w:pStyle w:val="Corpsdetexte"/>
+        <w:pStyle w:val="BodyText"/>
         <w:bidi w:val="0"/>
         <w:spacing w:before="0" w:after="140"/>
         <w:jc w:val="left"/>
@@ -441,7 +417,7 @@
       </w:r>
       <w:r>
         <w:rPr>
-          <w:rFonts w:cs="Calibri" w:ascii="Calibri" w:hAnsi="Calibri" w:asciiTheme="minorHAnsi" w:cstheme="minorHAnsi" w:hAnsiTheme="minorHAnsi"/>
+          <w:rFonts w:cs="" w:asciiTheme="minorHAnsi" w:cstheme="minorHAnsi" w:hAnsiTheme="minorHAnsi"/>
           <w:sz w:val="20"/>
           <w:szCs w:val="20"/>
         </w:rPr>
@@ -454,7 +430,7 @@
     </w:p>
     <w:p>
       <w:pPr>
-        <w:pStyle w:val="Corpsdetexte"/>
+        <w:pStyle w:val="BodyText"/>
         <w:bidi w:val="0"/>
         <w:spacing w:before="0" w:after="140"/>
         <w:jc w:val="left"/>
@@ -466,7 +442,7 @@
       </w:r>
       <w:r>
         <w:rPr>
-          <w:rFonts w:cs="Calibri" w:ascii="Calibri" w:hAnsi="Calibri" w:asciiTheme="minorHAnsi" w:cstheme="minorHAnsi" w:hAnsiTheme="minorHAnsi"/>
+          <w:rFonts w:cs="" w:asciiTheme="minorHAnsi" w:cstheme="minorHAnsi" w:hAnsiTheme="minorHAnsi"/>
           <w:sz w:val="20"/>
           <w:szCs w:val="20"/>
         </w:rPr>
@@ -479,7 +455,7 @@
     </w:p>
     <w:p>
       <w:pPr>
-        <w:pStyle w:val="Corpsdetexte"/>
+        <w:pStyle w:val="BodyText"/>
         <w:bidi w:val="0"/>
         <w:spacing w:before="0" w:after="140"/>
         <w:jc w:val="left"/>
@@ -491,7 +467,7 @@
       </w:r>
       <w:r>
         <w:rPr>
-          <w:rFonts w:cs="Calibri" w:ascii="Calibri" w:hAnsi="Calibri" w:asciiTheme="minorHAnsi" w:cstheme="minorHAnsi" w:hAnsiTheme="minorHAnsi"/>
+          <w:rFonts w:cs="" w:asciiTheme="minorHAnsi" w:cstheme="minorHAnsi" w:hAnsiTheme="minorHAnsi"/>
           <w:sz w:val="20"/>
           <w:szCs w:val="20"/>
         </w:rPr>
@@ -504,7 +480,7 @@
     </w:p>
     <w:p>
       <w:pPr>
-        <w:pStyle w:val="Corpsdetexte"/>
+        <w:pStyle w:val="BodyText"/>
         <w:bidi w:val="0"/>
         <w:spacing w:before="0" w:after="140"/>
         <w:jc w:val="left"/>
@@ -516,7 +492,7 @@
       </w:r>
       <w:r>
         <w:rPr>
-          <w:rFonts w:cs="Calibri" w:ascii="Calibri" w:hAnsi="Calibri" w:asciiTheme="minorHAnsi" w:cstheme="minorHAnsi" w:hAnsiTheme="minorHAnsi"/>
+          <w:rFonts w:cs="" w:asciiTheme="minorHAnsi" w:cstheme="minorHAnsi" w:hAnsiTheme="minorHAnsi"/>
           <w:sz w:val="20"/>
           <w:szCs w:val="20"/>
         </w:rPr>
@@ -529,7 +505,7 @@
     </w:p>
     <w:p>
       <w:pPr>
-        <w:pStyle w:val="Corpsdetexte"/>
+        <w:pStyle w:val="BodyText"/>
         <w:bidi w:val="0"/>
         <w:spacing w:before="0" w:after="140"/>
         <w:jc w:val="left"/>
@@ -541,7 +517,7 @@
     </w:p>
     <w:p>
       <w:pPr>
-        <w:pStyle w:val="Titre4"/>
+        <w:pStyle w:val="Heading4"/>
         <w:numPr>
           <w:ilvl w:val="3"/>
           <w:numId w:val="2"/>
@@ -557,18 +533,18 @@
     </w:p>
     <w:p>
       <w:pPr>
-        <w:pStyle w:val="Lignehorizontale"/>
-        <w:bidi w:val="0"/>
-        <w:jc w:val="left"/>
-        <w:rPr/>
-      </w:pPr>
-      <w:r>
-        <w:rPr/>
-      </w:r>
-    </w:p>
-    <w:p>
-      <w:pPr>
-        <w:pStyle w:val="Corpsdetexte"/>
+        <w:pStyle w:val="Lignehorizontaleuser"/>
+        <w:bidi w:val="0"/>
+        <w:jc w:val="left"/>
+        <w:rPr/>
+      </w:pPr>
+      <w:r>
+        <w:rPr/>
+      </w:r>
+    </w:p>
+    <w:p>
+      <w:pPr>
+        <w:pStyle w:val="BodyText"/>
         <w:bidi w:val="0"/>
         <w:spacing w:before="0" w:after="140"/>
         <w:jc w:val="left"/>
@@ -580,7 +556,7 @@
       </w:r>
       <w:r>
         <w:rPr>
-          <w:rFonts w:cs="Calibri" w:ascii="Calibri" w:hAnsi="Calibri" w:asciiTheme="minorHAnsi" w:cstheme="minorHAnsi" w:hAnsiTheme="minorHAnsi"/>
+          <w:rFonts w:cs="" w:asciiTheme="minorHAnsi" w:cstheme="minorHAnsi" w:hAnsiTheme="minorHAnsi"/>
           <w:sz w:val="20"/>
           <w:szCs w:val="20"/>
         </w:rPr>
@@ -593,7 +569,7 @@
     </w:p>
     <w:p>
       <w:pPr>
-        <w:pStyle w:val="Corpsdetexte"/>
+        <w:pStyle w:val="BodyText"/>
         <w:bidi w:val="0"/>
         <w:spacing w:before="0" w:after="140"/>
         <w:jc w:val="left"/>
@@ -605,7 +581,7 @@
       </w:r>
       <w:r>
         <w:rPr>
-          <w:rFonts w:cs="Calibri" w:ascii="Calibri" w:hAnsi="Calibri" w:asciiTheme="minorHAnsi" w:cstheme="minorHAnsi" w:hAnsiTheme="minorHAnsi"/>
+          <w:rFonts w:cs="" w:asciiTheme="minorHAnsi" w:cstheme="minorHAnsi" w:hAnsiTheme="minorHAnsi"/>
           <w:sz w:val="20"/>
           <w:szCs w:val="20"/>
         </w:rPr>
@@ -618,7 +594,7 @@
     </w:p>
     <w:p>
       <w:pPr>
-        <w:pStyle w:val="Corpsdetexte"/>
+        <w:pStyle w:val="BodyText"/>
         <w:bidi w:val="0"/>
         <w:spacing w:before="0" w:after="140"/>
         <w:jc w:val="left"/>
@@ -630,7 +606,7 @@
       </w:r>
       <w:r>
         <w:rPr>
-          <w:rFonts w:cs="Calibri" w:ascii="Calibri" w:hAnsi="Calibri" w:asciiTheme="minorHAnsi" w:cstheme="minorHAnsi" w:hAnsiTheme="minorHAnsi"/>
+          <w:rFonts w:cs="" w:asciiTheme="minorHAnsi" w:cstheme="minorHAnsi" w:hAnsiTheme="minorHAnsi"/>
           <w:sz w:val="20"/>
           <w:szCs w:val="20"/>
         </w:rPr>
@@ -642,7 +618,7 @@
       </w:r>
       <w:r>
         <w:rPr>
-          <w:rFonts w:cs="Calibri" w:ascii="Calibri" w:hAnsi="Calibri" w:asciiTheme="minorHAnsi" w:cstheme="minorHAnsi" w:hAnsiTheme="minorHAnsi"/>
+          <w:rFonts w:cs="" w:asciiTheme="minorHAnsi" w:cstheme="minorHAnsi" w:hAnsiTheme="minorHAnsi"/>
           <w:sz w:val="20"/>
           <w:szCs w:val="20"/>
         </w:rPr>
@@ -655,7 +631,7 @@
     </w:p>
     <w:p>
       <w:pPr>
-        <w:pStyle w:val="Corpsdetexte"/>
+        <w:pStyle w:val="BodyText"/>
         <w:bidi w:val="0"/>
         <w:spacing w:before="0" w:after="140"/>
         <w:jc w:val="left"/>
@@ -667,7 +643,7 @@
       </w:r>
       <w:r>
         <w:rPr>
-          <w:rFonts w:cs="Calibri" w:ascii="Calibri" w:hAnsi="Calibri" w:asciiTheme="minorHAnsi" w:cstheme="minorHAnsi" w:hAnsiTheme="minorHAnsi"/>
+          <w:rFonts w:cs="" w:asciiTheme="minorHAnsi" w:cstheme="minorHAnsi" w:hAnsiTheme="minorHAnsi"/>
           <w:sz w:val="20"/>
           <w:szCs w:val="20"/>
         </w:rPr>
@@ -680,7 +656,7 @@
     </w:p>
     <w:p>
       <w:pPr>
-        <w:pStyle w:val="Corpsdetexte"/>
+        <w:pStyle w:val="BodyText"/>
         <w:bidi w:val="0"/>
         <w:spacing w:before="0" w:after="140"/>
         <w:jc w:val="left"/>
@@ -703,7 +679,7 @@
       </w:r>
       <w:r>
         <w:rPr>
-          <w:rFonts w:eastAsia="Noto Serif CJK SC" w:cs="Calibri" w:ascii="Calibri" w:hAnsi="Calibri" w:asciiTheme="minorHAnsi" w:cstheme="minorHAnsi" w:hAnsiTheme="minorHAnsi"/>
+          <w:rFonts w:eastAsia="Noto Serif CJK SC" w:cs="" w:asciiTheme="minorHAnsi" w:cstheme="minorHAnsi" w:hAnsiTheme="minorHAnsi"/>
           <w:color w:val="auto"/>
           <w:kern w:val="2"/>
           <w:sz w:val="20"/>
@@ -726,7 +702,7 @@
     </w:p>
     <w:p>
       <w:pPr>
-        <w:pStyle w:val="Corpsdetexte"/>
+        <w:pStyle w:val="BodyText"/>
         <w:bidi w:val="0"/>
         <w:spacing w:before="0" w:after="140"/>
         <w:jc w:val="left"/>
@@ -745,7 +721,7 @@
       </w:r>
       <w:r>
         <w:rPr>
-          <w:rFonts w:eastAsia="Noto Serif CJK SC" w:cs="Calibri" w:ascii="Calibri" w:hAnsi="Calibri" w:asciiTheme="minorHAnsi" w:cstheme="minorHAnsi" w:hAnsiTheme="minorHAnsi"/>
+          <w:rFonts w:eastAsia="Noto Serif CJK SC" w:cs="" w:asciiTheme="minorHAnsi" w:cstheme="minorHAnsi" w:hAnsiTheme="minorHAnsi"/>
           <w:color w:val="auto"/>
           <w:kern w:val="2"/>
           <w:sz w:val="20"/>
@@ -768,7 +744,7 @@
     </w:p>
     <w:p>
       <w:pPr>
-        <w:pStyle w:val="Corpsdetexte"/>
+        <w:pStyle w:val="BodyText"/>
         <w:bidi w:val="0"/>
         <w:spacing w:before="0" w:after="140"/>
         <w:jc w:val="left"/>
@@ -787,7 +763,7 @@
       </w:r>
       <w:r>
         <w:rPr>
-          <w:rFonts w:eastAsia="Noto Serif CJK SC" w:cs="Calibri" w:ascii="Calibri" w:hAnsi="Calibri" w:asciiTheme="minorHAnsi" w:cstheme="minorHAnsi" w:hAnsiTheme="minorHAnsi"/>
+          <w:rFonts w:eastAsia="Noto Serif CJK SC" w:cs="" w:asciiTheme="minorHAnsi" w:cstheme="minorHAnsi" w:hAnsiTheme="minorHAnsi"/>
           <w:color w:val="auto"/>
           <w:kern w:val="2"/>
           <w:sz w:val="20"/>
@@ -810,7 +786,7 @@
     </w:p>
     <w:p>
       <w:pPr>
-        <w:pStyle w:val="Titre4"/>
+        <w:pStyle w:val="Heading4"/>
         <w:numPr>
           <w:ilvl w:val="3"/>
           <w:numId w:val="2"/>
@@ -826,18 +802,18 @@
     </w:p>
     <w:p>
       <w:pPr>
-        <w:pStyle w:val="Lignehorizontale"/>
-        <w:bidi w:val="0"/>
-        <w:jc w:val="left"/>
-        <w:rPr/>
-      </w:pPr>
-      <w:r>
-        <w:rPr/>
-      </w:r>
-    </w:p>
-    <w:p>
-      <w:pPr>
-        <w:pStyle w:val="Corpsdetexte"/>
+        <w:pStyle w:val="Lignehorizontaleuser"/>
+        <w:bidi w:val="0"/>
+        <w:jc w:val="left"/>
+        <w:rPr/>
+      </w:pPr>
+      <w:r>
+        <w:rPr/>
+      </w:r>
+    </w:p>
+    <w:p>
+      <w:pPr>
+        <w:pStyle w:val="BodyText"/>
         <w:bidi w:val="0"/>
         <w:spacing w:before="0" w:after="140"/>
         <w:jc w:val="left"/>
@@ -856,7 +832,7 @@
       </w:r>
       <w:r>
         <w:rPr>
-          <w:rFonts w:eastAsia="Noto Serif CJK SC" w:cs="Calibri" w:ascii="Calibri" w:hAnsi="Calibri" w:asciiTheme="minorHAnsi" w:cstheme="minorHAnsi" w:hAnsiTheme="minorHAnsi"/>
+          <w:rFonts w:eastAsia="Noto Serif CJK SC" w:cs="" w:asciiTheme="minorHAnsi" w:cstheme="minorHAnsi" w:hAnsiTheme="minorHAnsi"/>
           <w:color w:val="auto"/>
           <w:kern w:val="2"/>
           <w:sz w:val="20"/>
@@ -879,7 +855,7 @@
     </w:p>
     <w:p>
       <w:pPr>
-        <w:pStyle w:val="Corpsdetexte"/>
+        <w:pStyle w:val="BodyText"/>
         <w:bidi w:val="0"/>
         <w:spacing w:before="0" w:after="140"/>
         <w:jc w:val="left"/>
@@ -905,7 +881,7 @@
     </w:p>
     <w:p>
       <w:pPr>
-        <w:pStyle w:val="Titre4"/>
+        <w:pStyle w:val="Heading4"/>
         <w:numPr>
           <w:ilvl w:val="3"/>
           <w:numId w:val="2"/>
@@ -921,18 +897,18 @@
     </w:p>
     <w:p>
       <w:pPr>
-        <w:pStyle w:val="Lignehorizontale"/>
-        <w:bidi w:val="0"/>
-        <w:jc w:val="left"/>
-        <w:rPr/>
-      </w:pPr>
-      <w:r>
-        <w:rPr/>
-      </w:r>
-    </w:p>
-    <w:p>
-      <w:pPr>
-        <w:pStyle w:val="Corpsdetexte"/>
+        <w:pStyle w:val="Lignehorizontaleuser"/>
+        <w:bidi w:val="0"/>
+        <w:jc w:val="left"/>
+        <w:rPr/>
+      </w:pPr>
+      <w:r>
+        <w:rPr/>
+      </w:r>
+    </w:p>
+    <w:p>
+      <w:pPr>
+        <w:pStyle w:val="BodyText"/>
         <w:rPr/>
       </w:pPr>
       <w:r>
@@ -942,7 +918,7 @@
     </w:p>
     <w:p>
       <w:pPr>
-        <w:pStyle w:val="Corpsdetexte"/>
+        <w:pStyle w:val="BodyText"/>
         <w:rPr/>
       </w:pPr>
       <w:r>
@@ -952,7 +928,7 @@
     </w:p>
     <w:p>
       <w:pPr>
-        <w:pStyle w:val="Corpsdetexte"/>
+        <w:pStyle w:val="BodyText"/>
         <w:rPr/>
       </w:pPr>
       <w:r>
@@ -962,16 +938,16 @@
     </w:p>
     <w:p>
       <w:pPr>
-        <w:pStyle w:val="Corpsdetexte"/>
-        <w:rPr/>
-      </w:pPr>
-      <w:r>
-        <w:rPr/>
-      </w:r>
-    </w:p>
-    <w:p>
-      <w:pPr>
-        <w:pStyle w:val="Titre4"/>
+        <w:pStyle w:val="BodyText"/>
+        <w:rPr/>
+      </w:pPr>
+      <w:r>
+        <w:rPr/>
+      </w:r>
+    </w:p>
+    <w:p>
+      <w:pPr>
+        <w:pStyle w:val="Heading4"/>
         <w:numPr>
           <w:ilvl w:val="3"/>
           <w:numId w:val="2"/>
@@ -987,18 +963,18 @@
     </w:p>
     <w:p>
       <w:pPr>
-        <w:pStyle w:val="Lignehorizontale"/>
-        <w:bidi w:val="0"/>
-        <w:jc w:val="left"/>
-        <w:rPr/>
-      </w:pPr>
-      <w:r>
-        <w:rPr/>
-      </w:r>
-    </w:p>
-    <w:p>
-      <w:pPr>
-        <w:pStyle w:val="Corpsdetexte"/>
+        <w:pStyle w:val="Lignehorizontaleuser"/>
+        <w:bidi w:val="0"/>
+        <w:jc w:val="left"/>
+        <w:rPr/>
+      </w:pPr>
+      <w:r>
+        <w:rPr/>
+      </w:r>
+    </w:p>
+    <w:p>
+      <w:pPr>
+        <w:pStyle w:val="BodyText"/>
         <w:rPr/>
       </w:pPr>
       <w:r>
@@ -1008,7 +984,7 @@
     </w:p>
     <w:p>
       <w:pPr>
-        <w:pStyle w:val="Corpsdetexte"/>
+        <w:pStyle w:val="BodyText"/>
         <w:rPr/>
       </w:pPr>
       <w:r>
@@ -1018,7 +994,7 @@
     </w:p>
     <w:p>
       <w:pPr>
-        <w:pStyle w:val="Corpsdetexte"/>
+        <w:pStyle w:val="BodyText"/>
         <w:rPr/>
       </w:pPr>
       <w:r>
@@ -1027,7 +1003,7 @@
       </w:r>
       <w:r>
         <w:rPr>
-          <w:rFonts w:cs="Calibri" w:ascii="Calibri" w:hAnsi="Calibri" w:asciiTheme="minorHAnsi" w:cstheme="minorHAnsi" w:hAnsiTheme="minorHAnsi"/>
+          <w:rFonts w:cs="" w:asciiTheme="minorHAnsi" w:cstheme="minorHAnsi" w:hAnsiTheme="minorHAnsi"/>
           <w:sz w:val="20"/>
           <w:szCs w:val="20"/>
         </w:rPr>
@@ -1040,7 +1016,7 @@
     </w:p>
     <w:p>
       <w:pPr>
-        <w:pStyle w:val="Corpsdetexte"/>
+        <w:pStyle w:val="BodyText"/>
         <w:rPr/>
       </w:pPr>
       <w:r>
@@ -1049,7 +1025,7 @@
       </w:r>
       <w:r>
         <w:rPr>
-          <w:rFonts w:cs="Calibri" w:ascii="Calibri" w:hAnsi="Calibri" w:asciiTheme="minorHAnsi" w:cstheme="minorHAnsi" w:hAnsiTheme="minorHAnsi"/>
+          <w:rFonts w:cs="" w:asciiTheme="minorHAnsi" w:cstheme="minorHAnsi" w:hAnsiTheme="minorHAnsi"/>
           <w:sz w:val="20"/>
           <w:szCs w:val="20"/>
         </w:rPr>
@@ -1062,7 +1038,7 @@
     </w:p>
     <w:p>
       <w:pPr>
-        <w:pStyle w:val="Corpsdetexte"/>
+        <w:pStyle w:val="BodyText"/>
         <w:rPr/>
       </w:pPr>
       <w:r>
@@ -1071,7 +1047,7 @@
       </w:r>
       <w:r>
         <w:rPr>
-          <w:rFonts w:cs="Calibri" w:ascii="Calibri" w:hAnsi="Calibri" w:asciiTheme="minorHAnsi" w:cstheme="minorHAnsi" w:hAnsiTheme="minorHAnsi"/>
+          <w:rFonts w:cs="" w:asciiTheme="minorHAnsi" w:cstheme="minorHAnsi" w:hAnsiTheme="minorHAnsi"/>
           <w:sz w:val="20"/>
           <w:szCs w:val="20"/>
         </w:rPr>
@@ -1084,7 +1060,7 @@
     </w:p>
     <w:p>
       <w:pPr>
-        <w:pStyle w:val="Corpsdetexte"/>
+        <w:pStyle w:val="BodyText"/>
         <w:rPr/>
       </w:pPr>
       <w:r>
@@ -1093,7 +1069,7 @@
       </w:r>
       <w:r>
         <w:rPr>
-          <w:rFonts w:cs="Calibri" w:ascii="Calibri" w:hAnsi="Calibri" w:asciiTheme="minorHAnsi" w:cstheme="minorHAnsi" w:hAnsiTheme="minorHAnsi"/>
+          <w:rFonts w:cs="" w:asciiTheme="minorHAnsi" w:cstheme="minorHAnsi" w:hAnsiTheme="minorHAnsi"/>
           <w:sz w:val="20"/>
           <w:szCs w:val="20"/>
         </w:rPr>
@@ -1106,7 +1082,7 @@
     </w:p>
     <w:p>
       <w:pPr>
-        <w:pStyle w:val="Corpsdetexte"/>
+        <w:pStyle w:val="BodyText"/>
         <w:rPr/>
       </w:pPr>
       <w:r>
@@ -1115,7 +1091,7 @@
       </w:r>
       <w:r>
         <w:rPr>
-          <w:rFonts w:cs="Calibri" w:ascii="Calibri" w:hAnsi="Calibri" w:asciiTheme="minorHAnsi" w:cstheme="minorHAnsi" w:hAnsiTheme="minorHAnsi"/>
+          <w:rFonts w:cs="" w:asciiTheme="minorHAnsi" w:cstheme="minorHAnsi" w:hAnsiTheme="minorHAnsi"/>
           <w:sz w:val="20"/>
           <w:szCs w:val="20"/>
         </w:rPr>
@@ -1128,7 +1104,7 @@
     </w:p>
     <w:p>
       <w:pPr>
-        <w:pStyle w:val="Corpsdetexte"/>
+        <w:pStyle w:val="BodyText"/>
         <w:rPr/>
       </w:pPr>
       <w:r>
@@ -1137,7 +1113,7 @@
       </w:r>
       <w:r>
         <w:rPr>
-          <w:rFonts w:cs="Calibri" w:ascii="Calibri" w:hAnsi="Calibri" w:asciiTheme="minorHAnsi" w:cstheme="minorHAnsi" w:hAnsiTheme="minorHAnsi"/>
+          <w:rFonts w:cs="" w:asciiTheme="minorHAnsi" w:cstheme="minorHAnsi" w:hAnsiTheme="minorHAnsi"/>
           <w:sz w:val="20"/>
           <w:szCs w:val="20"/>
         </w:rPr>
@@ -1150,7 +1126,7 @@
     </w:p>
     <w:p>
       <w:pPr>
-        <w:pStyle w:val="Corpsdetexte"/>
+        <w:pStyle w:val="BodyText"/>
         <w:rPr/>
       </w:pPr>
       <w:r>
@@ -1159,7 +1135,7 @@
       </w:r>
       <w:r>
         <w:rPr>
-          <w:rFonts w:cs="Calibri" w:ascii="Calibri" w:hAnsi="Calibri" w:asciiTheme="minorHAnsi" w:cstheme="minorHAnsi" w:hAnsiTheme="minorHAnsi"/>
+          <w:rFonts w:cs="" w:asciiTheme="minorHAnsi" w:cstheme="minorHAnsi" w:hAnsiTheme="minorHAnsi"/>
           <w:sz w:val="20"/>
           <w:szCs w:val="20"/>
         </w:rPr>
@@ -1172,16 +1148,16 @@
     </w:p>
     <w:p>
       <w:pPr>
-        <w:pStyle w:val="Corpsdetexte"/>
-        <w:rPr/>
-      </w:pPr>
-      <w:r>
-        <w:rPr/>
-        <w:t xml:space="preserve">Commune : {{ etablissement.commune </w:t>
-      </w:r>
-      <w:r>
-        <w:rPr>
-          <w:rFonts w:cs="Calibri" w:ascii="Calibri" w:hAnsi="Calibri" w:asciiTheme="minorHAnsi" w:cstheme="minorHAnsi" w:hAnsiTheme="minorHAnsi"/>
+        <w:pStyle w:val="BodyText"/>
+        <w:rPr/>
+      </w:pPr>
+      <w:r>
+        <w:rPr/>
+        <w:t xml:space="preserve">Commune : {{ etablissement.commune_and_cp </w:t>
+      </w:r>
+      <w:r>
+        <w:rPr>
+          <w:rFonts w:cs="" w:asciiTheme="minorHAnsi" w:cstheme="minorHAnsi" w:hAnsiTheme="minorHAnsi"/>
           <w:sz w:val="20"/>
           <w:szCs w:val="20"/>
         </w:rPr>
@@ -1194,24 +1170,16 @@
     </w:p>
     <w:p>
       <w:pPr>
-        <w:pStyle w:val="Corpsdetexte"/>
-        <w:rPr/>
-      </w:pPr>
-      <w:r>
-        <w:rPr/>
-        <w:t>Departement : {{ etablissement.departement.__</w:t>
-      </w:r>
-      <w:r>
-        <w:rPr/>
-        <w:t>str__()</w:t>
-      </w:r>
-      <w:r>
-        <w:rPr/>
-        <w:t xml:space="preserve"> </w:t>
-      </w:r>
-      <w:r>
-        <w:rPr>
-          <w:rFonts w:cs="Calibri" w:ascii="Calibri" w:hAnsi="Calibri" w:asciiTheme="minorHAnsi" w:cstheme="minorHAnsi" w:hAnsiTheme="minorHAnsi"/>
+        <w:pStyle w:val="BodyText"/>
+        <w:rPr/>
+      </w:pPr>
+      <w:r>
+        <w:rPr/>
+        <w:t xml:space="preserve">Departement : {{ etablissement.departement.__str__() </w:t>
+      </w:r>
+      <w:r>
+        <w:rPr>
+          <w:rFonts w:cs="" w:asciiTheme="minorHAnsi" w:cstheme="minorHAnsi" w:hAnsiTheme="minorHAnsi"/>
           <w:sz w:val="20"/>
           <w:szCs w:val="20"/>
         </w:rPr>
@@ -1224,7 +1192,7 @@
     </w:p>
     <w:p>
       <w:pPr>
-        <w:pStyle w:val="Corpsdetexte"/>
+        <w:pStyle w:val="BodyText"/>
         <w:rPr/>
       </w:pPr>
       <w:r>
@@ -1233,7 +1201,7 @@
       </w:r>
       <w:r>
         <w:rPr>
-          <w:rFonts w:cs="Calibri" w:ascii="Calibri" w:hAnsi="Calibri" w:asciiTheme="minorHAnsi" w:cstheme="minorHAnsi" w:hAnsiTheme="minorHAnsi"/>
+          <w:rFonts w:cs="" w:asciiTheme="minorHAnsi" w:cstheme="minorHAnsi" w:hAnsiTheme="minorHAnsi"/>
           <w:sz w:val="20"/>
           <w:szCs w:val="20"/>
         </w:rPr>
@@ -1246,7 +1214,7 @@
     </w:p>
     <w:p>
       <w:pPr>
-        <w:pStyle w:val="Corpsdetexte"/>
+        <w:pStyle w:val="BodyText"/>
         <w:rPr/>
       </w:pPr>
       <w:r>
@@ -1255,7 +1223,7 @@
       </w:r>
       <w:r>
         <w:rPr>
-          <w:rFonts w:cs="Calibri" w:ascii="Calibri" w:hAnsi="Calibri" w:asciiTheme="minorHAnsi" w:cstheme="minorHAnsi" w:hAnsiTheme="minorHAnsi"/>
+          <w:rFonts w:cs="" w:asciiTheme="minorHAnsi" w:cstheme="minorHAnsi" w:hAnsiTheme="minorHAnsi"/>
           <w:sz w:val="20"/>
           <w:szCs w:val="20"/>
         </w:rPr>
@@ -1277,7 +1245,7 @@
     </w:p>
     <w:p>
       <w:pPr>
-        <w:pStyle w:val="Corpsdetexte"/>
+        <w:pStyle w:val="BodyText"/>
         <w:rPr/>
       </w:pPr>
       <w:r>
@@ -1287,7 +1255,7 @@
     </w:p>
     <w:p>
       <w:pPr>
-        <w:pStyle w:val="Corpsdetexte"/>
+        <w:pStyle w:val="BodyText"/>
         <w:bidi w:val="0"/>
         <w:spacing w:before="0" w:after="140"/>
         <w:jc w:val="left"/>
@@ -1313,7 +1281,7 @@
     </w:p>
     <w:p>
       <w:pPr>
-        <w:pStyle w:val="Titre4"/>
+        <w:pStyle w:val="Heading4"/>
         <w:numPr>
           <w:ilvl w:val="3"/>
           <w:numId w:val="2"/>
@@ -1329,18 +1297,18 @@
     </w:p>
     <w:p>
       <w:pPr>
-        <w:pStyle w:val="Lignehorizontale"/>
-        <w:bidi w:val="0"/>
-        <w:jc w:val="left"/>
-        <w:rPr/>
-      </w:pPr>
-      <w:r>
-        <w:rPr/>
-      </w:r>
-    </w:p>
-    <w:p>
-      <w:pPr>
-        <w:pStyle w:val="Corpsdetexte"/>
+        <w:pStyle w:val="Lignehorizontaleuser"/>
+        <w:bidi w:val="0"/>
+        <w:jc w:val="left"/>
+        <w:rPr/>
+      </w:pPr>
+      <w:r>
+        <w:rPr/>
+      </w:r>
+    </w:p>
+    <w:p>
+      <w:pPr>
+        <w:pStyle w:val="BodyText"/>
         <w:rPr/>
       </w:pPr>
       <w:r>
@@ -1350,7 +1318,7 @@
     </w:p>
     <w:p>
       <w:pPr>
-        <w:pStyle w:val="Corpsdetexte"/>
+        <w:pStyle w:val="BodyText"/>
         <w:rPr/>
       </w:pPr>
       <w:r>
@@ -1360,6 +1328,8 @@
     </w:p>
     <w:p>
       <w:pPr>
+        <w:pStyle w:val="BodyText"/>
+        <w:rPr/>
         <w:sectPr>
           <w:type w:val="nextPage"/>
           <w:pgSz w:w="11906" w:h="16838"/>
@@ -1369,8 +1339,6 @@
           <w:textDirection w:val="lrTb"/>
           <w:docGrid w:type="default" w:linePitch="100" w:charSpace="0"/>
         </w:sectPr>
-        <w:pStyle w:val="Corpsdetexte"/>
-        <w:rPr/>
       </w:pPr>
       <w:r>
         <w:rPr/>
@@ -1379,7 +1347,7 @@
     </w:p>
     <w:p>
       <w:pPr>
-        <w:pStyle w:val="Titre4"/>
+        <w:pStyle w:val="Heading4"/>
         <w:numPr>
           <w:ilvl w:val="3"/>
           <w:numId w:val="2"/>
@@ -1403,7 +1371,7 @@
     </w:p>
     <w:p>
       <w:pPr>
-        <w:pStyle w:val="Lignehorizontale"/>
+        <w:pStyle w:val="Lignehorizontaleuser"/>
         <w:rPr>
           <w:rFonts w:ascii="Liberation Serif" w:hAnsi="Liberation Serif" w:eastAsia="Noto Serif CJK SC" w:cs="Lohit Devanagari"/>
           <w:color w:val="auto"/>
@@ -1751,10 +1719,10 @@
       <w:lang w:val="fr-FR" w:eastAsia="zh-CN" w:bidi="hi-IN"/>
     </w:rPr>
   </w:style>
-  <w:style w:type="paragraph" w:styleId="Titre1">
-    <w:name w:val="Heading 1"/>
-    <w:basedOn w:val="Titre"/>
-    <w:next w:val="Corpsdetexte"/>
+  <w:style w:type="paragraph" w:styleId="Heading1">
+    <w:name w:val="heading 1"/>
+    <w:basedOn w:val="Titreuser"/>
+    <w:next w:val="BodyText"/>
     <w:qFormat/>
     <w:pPr>
       <w:numPr>
@@ -1771,10 +1739,10 @@
       <w:szCs w:val="36"/>
     </w:rPr>
   </w:style>
-  <w:style w:type="paragraph" w:styleId="Titre4">
-    <w:name w:val="Heading 4"/>
-    <w:basedOn w:val="Titre"/>
-    <w:next w:val="Corpsdetexte"/>
+  <w:style w:type="paragraph" w:styleId="Heading4">
+    <w:name w:val="heading 4"/>
+    <w:basedOn w:val="Titreuser"/>
+    <w:next w:val="BodyText"/>
     <w:qFormat/>
     <w:pPr>
       <w:numPr>
@@ -1804,19 +1772,19 @@
   <w:style w:type="paragraph" w:styleId="Titre">
     <w:name w:val="Titre"/>
     <w:basedOn w:val="Normal"/>
-    <w:next w:val="Corpsdetexte"/>
+    <w:next w:val="BodyText"/>
     <w:qFormat/>
     <w:pPr>
       <w:keepNext w:val="true"/>
       <w:spacing w:before="240" w:after="120"/>
     </w:pPr>
     <w:rPr>
-      <w:rFonts w:ascii="Liberation Sans" w:hAnsi="Liberation Sans" w:eastAsia="Noto Sans CJK SC" w:cs="Lohit Devanagari"/>
+      <w:rFonts w:ascii="Liberation Sans" w:hAnsi="Liberation Sans" w:eastAsia="Noto Sans CJK SC" w:cs="Noto Sans Devanagari"/>
       <w:sz w:val="28"/>
       <w:szCs w:val="28"/>
     </w:rPr>
   </w:style>
-  <w:style w:type="paragraph" w:styleId="Corpsdetexte">
+  <w:style w:type="paragraph" w:styleId="BodyText">
     <w:name w:val="Body Text"/>
     <w:basedOn w:val="Normal"/>
     <w:pPr>
@@ -1824,16 +1792,16 @@
     </w:pPr>
     <w:rPr/>
   </w:style>
-  <w:style w:type="paragraph" w:styleId="Liste">
+  <w:style w:type="paragraph" w:styleId="List">
     <w:name w:val="List"/>
-    <w:basedOn w:val="Corpsdetexte"/>
+    <w:basedOn w:val="BodyText"/>
     <w:pPr/>
     <w:rPr>
       <w:rFonts w:cs="Lohit Devanagari"/>
     </w:rPr>
   </w:style>
-  <w:style w:type="paragraph" w:styleId="Lgende">
-    <w:name w:val="Caption"/>
+  <w:style w:type="paragraph" w:styleId="Caption">
+    <w:name w:val="caption"/>
     <w:basedOn w:val="Normal"/>
     <w:qFormat/>
     <w:pPr>
@@ -1859,10 +1827,25 @@
       <w:rFonts w:cs="Lohit Devanagari"/>
     </w:rPr>
   </w:style>
-  <w:style w:type="paragraph" w:styleId="Titreprincipal">
+  <w:style w:type="paragraph" w:styleId="Titreuser">
+    <w:name w:val="Titre (user)"/>
+    <w:basedOn w:val="Normal"/>
+    <w:next w:val="BodyText"/>
+    <w:qFormat/>
+    <w:pPr>
+      <w:keepNext w:val="true"/>
+      <w:spacing w:before="240" w:after="120"/>
+    </w:pPr>
+    <w:rPr>
+      <w:rFonts w:ascii="Liberation Sans" w:hAnsi="Liberation Sans" w:eastAsia="Noto Sans CJK SC" w:cs="Lohit Devanagari"/>
+      <w:sz w:val="28"/>
+      <w:szCs w:val="28"/>
+    </w:rPr>
+  </w:style>
+  <w:style w:type="paragraph" w:styleId="Title">
     <w:name w:val="Title"/>
-    <w:basedOn w:val="Titre"/>
-    <w:next w:val="Corpsdetexte"/>
+    <w:basedOn w:val="Titreuser"/>
+    <w:next w:val="BodyText"/>
     <w:qFormat/>
     <w:pPr>
       <w:jc w:val="center"/>
@@ -1874,10 +1857,10 @@
       <w:szCs w:val="56"/>
     </w:rPr>
   </w:style>
-  <w:style w:type="paragraph" w:styleId="Lignehorizontale">
-    <w:name w:val="Ligne horizontale"/>
+  <w:style w:type="paragraph" w:styleId="Lignehorizontaleuser">
+    <w:name w:val="Ligne horizontale (user)"/>
     <w:basedOn w:val="Normal"/>
-    <w:next w:val="Corpsdetexte"/>
+    <w:next w:val="BodyText"/>
     <w:qFormat/>
     <w:pPr>
       <w:suppressLineNumbers/>
@@ -1891,8 +1874,8 @@
       <w:szCs w:val="12"/>
     </w:rPr>
   </w:style>
-  <w:style w:type="paragraph" w:styleId="Texteprformat">
-    <w:name w:val="Texte préformaté"/>
+  <w:style w:type="paragraph" w:styleId="Texteprformatuser">
+    <w:name w:val="Texte préformaté (user)"/>
     <w:basedOn w:val="Normal"/>
     <w:qFormat/>
     <w:pPr>
@@ -1906,7 +1889,7 @@
   </w:style>
   <w:style w:type="paragraph" w:styleId="LigneH2">
     <w:name w:val="Ligne H 2"/>
-    <w:basedOn w:val="Lignehorizontale"/>
+    <w:basedOn w:val="Lignehorizontaleuser"/>
     <w:qFormat/>
     <w:pPr>
       <w:pBdr>
@@ -1915,15 +1898,15 @@
     </w:pPr>
     <w:rPr/>
   </w:style>
-  <w:style w:type="paragraph" w:styleId="Contenudecadre">
-    <w:name w:val="Contenu de cadre"/>
+  <w:style w:type="paragraph" w:styleId="Contenudecadreuser">
+    <w:name w:val="Contenu de cadre (user)"/>
     <w:basedOn w:val="Normal"/>
     <w:qFormat/>
     <w:pPr/>
     <w:rPr/>
   </w:style>
-  <w:style w:type="paragraph" w:styleId="Contenudetableau">
-    <w:name w:val="Contenu de tableau"/>
+  <w:style w:type="paragraph" w:styleId="Contenudetableauuser">
+    <w:name w:val="Contenu de tableau (user)"/>
     <w:basedOn w:val="Normal"/>
     <w:qFormat/>
     <w:pPr>
@@ -1933,4 +1916,110 @@
     <w:rPr/>
   </w:style>
 </w:styles>
+</file>
+
+<file path=word/theme/theme1.xml><?xml version="1.0" encoding="utf-8"?>
+<a:theme xmlns:a="http://schemas.openxmlformats.org/drawingml/2006/main" xmlns:r="http://schemas.openxmlformats.org/officeDocument/2006/relationships" name="Office">
+  <a:themeElements>
+    <a:clrScheme name="LibreOffice">
+      <a:dk1>
+        <a:srgbClr val="000000"/>
+      </a:dk1>
+      <a:lt1>
+        <a:srgbClr val="ffffff"/>
+      </a:lt1>
+      <a:dk2>
+        <a:srgbClr val="000000"/>
+      </a:dk2>
+      <a:lt2>
+        <a:srgbClr val="ffffff"/>
+      </a:lt2>
+      <a:accent1>
+        <a:srgbClr val="18a303"/>
+      </a:accent1>
+      <a:accent2>
+        <a:srgbClr val="0369a3"/>
+      </a:accent2>
+      <a:accent3>
+        <a:srgbClr val="a33e03"/>
+      </a:accent3>
+      <a:accent4>
+        <a:srgbClr val="8e03a3"/>
+      </a:accent4>
+      <a:accent5>
+        <a:srgbClr val="c99c00"/>
+      </a:accent5>
+      <a:accent6>
+        <a:srgbClr val="c9211e"/>
+      </a:accent6>
+      <a:hlink>
+        <a:srgbClr val="0000ee"/>
+      </a:hlink>
+      <a:folHlink>
+        <a:srgbClr val="551a8b"/>
+      </a:folHlink>
+    </a:clrScheme>
+    <a:fontScheme name="Office">
+      <a:majorFont>
+        <a:latin typeface="Arial" pitchFamily="0" charset="1"/>
+        <a:ea typeface="DejaVu Sans" pitchFamily="0" charset="1"/>
+        <a:cs typeface="DejaVu Sans" pitchFamily="0" charset="1"/>
+      </a:majorFont>
+      <a:minorFont>
+        <a:latin typeface="Arial" pitchFamily="0" charset="1"/>
+        <a:ea typeface="DejaVu Sans" pitchFamily="0" charset="1"/>
+        <a:cs typeface="DejaVu Sans" pitchFamily="0" charset="1"/>
+      </a:minorFont>
+    </a:fontScheme>
+    <a:fmtScheme>
+      <a:fillStyleLst>
+        <a:solidFill>
+          <a:schemeClr val="phClr"/>
+        </a:solidFill>
+        <a:solidFill>
+          <a:schemeClr val="phClr"/>
+        </a:solidFill>
+        <a:solidFill>
+          <a:schemeClr val="phClr"/>
+        </a:solidFill>
+      </a:fillStyleLst>
+      <a:lnStyleLst>
+        <a:ln w="6350" cap="flat" cmpd="sng" algn="ctr">
+          <a:prstDash val="solid"/>
+          <a:miter/>
+        </a:ln>
+        <a:ln w="6350" cap="flat" cmpd="sng" algn="ctr">
+          <a:prstDash val="solid"/>
+          <a:miter/>
+        </a:ln>
+        <a:ln w="6350" cap="flat" cmpd="sng" algn="ctr">
+          <a:prstDash val="solid"/>
+          <a:miter/>
+        </a:ln>
+      </a:lnStyleLst>
+      <a:effectStyleLst>
+        <a:effectStyle>
+          <a:effectLst/>
+        </a:effectStyle>
+        <a:effectStyle>
+          <a:effectLst/>
+        </a:effectStyle>
+        <a:effectStyle>
+          <a:effectLst/>
+        </a:effectStyle>
+      </a:effectStyleLst>
+      <a:bgFillStyleLst>
+        <a:solidFill>
+          <a:schemeClr val="phClr"/>
+        </a:solidFill>
+        <a:solidFill>
+          <a:schemeClr val="phClr"/>
+        </a:solidFill>
+        <a:solidFill>
+          <a:schemeClr val="phClr"/>
+        </a:solidFill>
+      </a:bgFillStyleLst>
+    </a:fmtScheme>
+  </a:themeElements>
+</a:theme>
 </file>
</xml_diff>

<commit_message>
Add publication date on all fiche objects
We want to known the difference between the creation date and the
publication date. Alerts are handled based on their publication date
(not using the creation date which can be internal to the structure).

Add the data in all exports / views.
</commit_message>
<xml_diff>
--- a/ssa/doc_templates/evenement_produit.docx
+++ b/ssa/doc_templates/evenement_produit.docx
@@ -1,25 +1,25 @@
 
 <file path=word/document.xml><?xml version="1.0" encoding="utf-8"?>
-<w:document xmlns:o="urn:schemas-microsoft-com:office:office" xmlns:r="http://schemas.openxmlformats.org/officeDocument/2006/relationships" xmlns:v="urn:schemas-microsoft-com:vml" xmlns:w="http://schemas.openxmlformats.org/wordprocessingml/2006/main" xmlns:w10="urn:schemas-microsoft-com:office:word" xmlns:wp="http://schemas.openxmlformats.org/drawingml/2006/wordprocessingDrawing" xmlns:pic="http://schemas.openxmlformats.org/drawingml/2006/picture" xmlns:wps="http://schemas.microsoft.com/office/word/2010/wordprocessingShape" xmlns:wpg="http://schemas.microsoft.com/office/word/2010/wordprocessingGroup" xmlns:mc="http://schemas.openxmlformats.org/markup-compatibility/2006" xmlns:wp14="http://schemas.microsoft.com/office/word/2010/wordprocessingDrawing" xmlns:w14="http://schemas.microsoft.com/office/word/2010/wordml" xmlns:w15="http://schemas.microsoft.com/office/word/2012/wordml" mc:Ignorable="w14 wp14 w15">
+<w:document xmlns:o="urn:schemas-microsoft-com:office:office" xmlns:r="http://schemas.openxmlformats.org/officeDocument/2006/relationships" xmlns:v="urn:schemas-microsoft-com:vml" xmlns:w="http://schemas.openxmlformats.org/wordprocessingml/2006/main" xmlns:w10="urn:schemas-microsoft-com:office:word" xmlns:wp="http://schemas.openxmlformats.org/drawingml/2006/wordprocessingDrawing" xmlns:wps="http://schemas.microsoft.com/office/word/2010/wordprocessingShape" xmlns:wpg="http://schemas.microsoft.com/office/word/2010/wordprocessingGroup" xmlns:mc="http://schemas.openxmlformats.org/markup-compatibility/2006" xmlns:wp14="http://schemas.microsoft.com/office/word/2010/wordprocessingDrawing" xmlns:w14="http://schemas.microsoft.com/office/word/2010/wordml" xmlns:w15="http://schemas.microsoft.com/office/word/2012/wordml" mc:Ignorable="w14 wp14 w15">
   <w:body>
     <w:p>
       <w:pPr>
-        <w:pStyle w:val="Heading1"/>
+        <w:pStyle w:val="Titre1"/>
         <w:numPr>
           <w:ilvl w:val="0"/>
-          <w:numId w:val="2"/>
+          <w:numId w:val="1"/>
         </w:numPr>
         <w:spacing w:before="240" w:after="120"/>
         <w:jc w:val="center"/>
         <w:rPr>
-          <w:rFonts w:cs="" w:asciiTheme="minorHAnsi" w:cstheme="minorHAnsi" w:hAnsiTheme="minorHAnsi"/>
+          <w:rFonts w:ascii="Arial" w:hAnsi="Arial" w:cs="Arial" w:asciiTheme="minorHAnsi" w:cstheme="minorHAnsi" w:hAnsiTheme="minorHAnsi"/>
           <w:sz w:val="28"/>
           <w:szCs w:val="28"/>
         </w:rPr>
       </w:pPr>
       <w:r>
         <w:rPr>
-          <w:rFonts w:cs="" w:asciiTheme="minorHAnsi" w:cstheme="minorHAnsi" w:hAnsiTheme="minorHAnsi"/>
+          <w:rFonts w:cs="Arial" w:ascii="Arial" w:hAnsi="Arial" w:asciiTheme="minorHAnsi" w:cstheme="minorHAnsi" w:hAnsiTheme="minorHAnsi"/>
           <w:sz w:val="28"/>
           <w:szCs w:val="28"/>
         </w:rPr>
@@ -28,23 +28,23 @@
     </w:p>
     <w:p>
       <w:pPr>
-        <w:pStyle w:val="Heading1"/>
+        <w:pStyle w:val="Titre1"/>
         <w:numPr>
           <w:ilvl w:val="0"/>
-          <w:numId w:val="2"/>
+          <w:numId w:val="1"/>
         </w:numPr>
         <w:bidi w:val="0"/>
         <w:spacing w:before="240" w:after="120"/>
         <w:jc w:val="center"/>
         <w:rPr>
-          <w:rFonts w:cs="" w:asciiTheme="minorHAnsi" w:cstheme="minorHAnsi" w:hAnsiTheme="minorHAnsi"/>
+          <w:rFonts w:ascii="Arial" w:hAnsi="Arial" w:cs="Arial" w:asciiTheme="minorHAnsi" w:cstheme="minorHAnsi" w:hAnsiTheme="minorHAnsi"/>
           <w:sz w:val="28"/>
           <w:szCs w:val="28"/>
         </w:rPr>
       </w:pPr>
       <w:r>
         <w:rPr>
-          <w:rFonts w:cs="" w:asciiTheme="minorHAnsi" w:cstheme="minorHAnsi" w:hAnsiTheme="minorHAnsi"/>
+          <w:rFonts w:cs="Arial" w:ascii="Arial" w:hAnsi="Arial" w:asciiTheme="minorHAnsi" w:cstheme="minorHAnsi" w:hAnsiTheme="minorHAnsi"/>
           <w:sz w:val="28"/>
           <w:szCs w:val="28"/>
         </w:rPr>
@@ -53,19 +53,19 @@
     </w:p>
     <w:p>
       <w:pPr>
-        <w:pStyle w:val="BodyText"/>
+        <w:pStyle w:val="Corpsdetexte"/>
         <w:bidi w:val="0"/>
         <w:spacing w:before="240" w:after="120"/>
         <w:jc w:val="center"/>
         <w:rPr>
-          <w:rFonts w:cs="" w:asciiTheme="minorHAnsi" w:cstheme="minorHAnsi" w:hAnsiTheme="minorHAnsi"/>
+          <w:rFonts w:ascii="Arial" w:hAnsi="Arial" w:cs="Arial" w:asciiTheme="minorHAnsi" w:cstheme="minorHAnsi" w:hAnsiTheme="minorHAnsi"/>
           <w:sz w:val="16"/>
           <w:szCs w:val="16"/>
         </w:rPr>
       </w:pPr>
       <w:r>
         <w:rPr>
-          <w:rFonts w:cs="" w:ascii="Calibri" w:hAnsi="Calibri" w:cstheme="minorHAnsi"/>
+          <w:rFonts w:cs="Arial" w:ascii="Calibri" w:hAnsi="Calibri" w:cstheme="minorHAnsi"/>
           <w:sz w:val="16"/>
           <w:szCs w:val="16"/>
         </w:rPr>
@@ -74,7 +74,7 @@
     </w:p>
     <w:p>
       <w:pPr>
-        <w:pStyle w:val="BodyText"/>
+        <w:pStyle w:val="Corpsdetexte"/>
         <w:bidi w:val="0"/>
         <w:jc w:val="center"/>
         <w:rPr/>
@@ -85,10 +85,10 @@
     </w:p>
     <w:p>
       <w:pPr>
-        <w:pStyle w:val="Heading4"/>
+        <w:pStyle w:val="Titre4"/>
         <w:numPr>
           <w:ilvl w:val="3"/>
-          <w:numId w:val="2"/>
+          <w:numId w:val="1"/>
         </w:numPr>
         <w:bidi w:val="0"/>
         <w:jc w:val="center"/>
@@ -101,7 +101,7 @@
     </w:p>
     <w:p>
       <w:pPr>
-        <w:pStyle w:val="Lignehorizontaleuser"/>
+        <w:pStyle w:val="Lignehorizontale"/>
         <w:suppressLineNumbers/>
         <w:pBdr>
           <w:bottom w:val="double" w:sz="2" w:space="0" w:color="808080"/>
@@ -117,7 +117,7 @@
     </w:p>
     <w:p>
       <w:pPr>
-        <w:pStyle w:val="BodyText"/>
+        <w:pStyle w:val="Corpsdetexte"/>
         <w:bidi w:val="0"/>
         <w:jc w:val="left"/>
         <w:rPr/>
@@ -129,7 +129,7 @@
     </w:p>
     <w:p>
       <w:pPr>
-        <w:pStyle w:val="BodyText"/>
+        <w:pStyle w:val="Corpsdetexte"/>
         <w:bidi w:val="0"/>
         <w:jc w:val="left"/>
         <w:rPr/>
@@ -141,7 +141,7 @@
     </w:p>
     <w:p>
       <w:pPr>
-        <w:pStyle w:val="BodyText"/>
+        <w:pStyle w:val="Corpsdetexte"/>
         <w:bidi w:val="0"/>
         <w:jc w:val="left"/>
         <w:rPr/>
@@ -153,7 +153,35 @@
     </w:p>
     <w:p>
       <w:pPr>
-        <w:pStyle w:val="BodyText"/>
+        <w:pStyle w:val="Corpsdetexte"/>
+        <w:bidi w:val="0"/>
+        <w:jc w:val="left"/>
+        <w:rPr/>
+      </w:pPr>
+      <w:r>
+        <w:rPr/>
+        <w:t xml:space="preserve">Date de </w:t>
+      </w:r>
+      <w:r>
+        <w:rPr/>
+        <w:t>publication</w:t>
+      </w:r>
+      <w:r>
+        <w:rPr/>
+        <w:t>: {{object.date_</w:t>
+      </w:r>
+      <w:r>
+        <w:rPr/>
+        <w:t>publication</w:t>
+      </w:r>
+      <w:r>
+        <w:rPr/>
+        <w:t>.strftime("%Y-%m-%d %H:%M") }}</w:t>
+      </w:r>
+    </w:p>
+    <w:p>
+      <w:pPr>
+        <w:pStyle w:val="Corpsdetexte"/>
         <w:bidi w:val="0"/>
         <w:jc w:val="left"/>
         <w:rPr/>
@@ -164,7 +192,7 @@
       </w:r>
       <w:r>
         <w:rPr>
-          <w:rFonts w:cs="" w:asciiTheme="minorHAnsi" w:cstheme="minorHAnsi" w:hAnsiTheme="minorHAnsi"/>
+          <w:rFonts w:cs="Arial" w:ascii="Arial" w:hAnsi="Arial" w:asciiTheme="minorHAnsi" w:cstheme="minorHAnsi" w:hAnsiTheme="minorHAnsi"/>
           <w:sz w:val="20"/>
           <w:szCs w:val="20"/>
         </w:rPr>
@@ -177,7 +205,7 @@
     </w:p>
     <w:p>
       <w:pPr>
-        <w:pStyle w:val="BodyText"/>
+        <w:pStyle w:val="Corpsdetexte"/>
         <w:bidi w:val="0"/>
         <w:jc w:val="left"/>
         <w:rPr/>
@@ -188,7 +216,7 @@
       </w:r>
       <w:r>
         <w:rPr>
-          <w:rFonts w:cs="" w:asciiTheme="minorHAnsi" w:cstheme="minorHAnsi" w:hAnsiTheme="minorHAnsi"/>
+          <w:rFonts w:cs="Arial" w:ascii="Arial" w:hAnsi="Arial" w:asciiTheme="minorHAnsi" w:cstheme="minorHAnsi" w:hAnsiTheme="minorHAnsi"/>
           <w:sz w:val="20"/>
           <w:szCs w:val="20"/>
         </w:rPr>
@@ -201,7 +229,7 @@
     </w:p>
     <w:p>
       <w:pPr>
-        <w:pStyle w:val="BodyText"/>
+        <w:pStyle w:val="Corpsdetexte"/>
         <w:bidi w:val="0"/>
         <w:jc w:val="left"/>
         <w:rPr/>
@@ -212,7 +240,7 @@
       </w:r>
       <w:r>
         <w:rPr>
-          <w:rFonts w:cs="" w:asciiTheme="minorHAnsi" w:cstheme="minorHAnsi" w:hAnsiTheme="minorHAnsi"/>
+          <w:rFonts w:cs="Arial" w:ascii="Arial" w:hAnsi="Arial" w:asciiTheme="minorHAnsi" w:cstheme="minorHAnsi" w:hAnsiTheme="minorHAnsi"/>
           <w:sz w:val="20"/>
           <w:szCs w:val="20"/>
         </w:rPr>
@@ -225,7 +253,7 @@
     </w:p>
     <w:p>
       <w:pPr>
-        <w:pStyle w:val="BodyText"/>
+        <w:pStyle w:val="Corpsdetexte"/>
         <w:bidi w:val="0"/>
         <w:jc w:val="left"/>
         <w:rPr/>
@@ -236,7 +264,7 @@
       </w:r>
       <w:r>
         <w:rPr>
-          <w:rFonts w:cs="" w:asciiTheme="minorHAnsi" w:cstheme="minorHAnsi" w:hAnsiTheme="minorHAnsi"/>
+          <w:rFonts w:cs="Arial" w:ascii="Arial" w:hAnsi="Arial" w:asciiTheme="minorHAnsi" w:cstheme="minorHAnsi" w:hAnsiTheme="minorHAnsi"/>
           <w:sz w:val="20"/>
           <w:szCs w:val="20"/>
         </w:rPr>
@@ -249,7 +277,7 @@
     </w:p>
     <w:p>
       <w:pPr>
-        <w:pStyle w:val="BodyText"/>
+        <w:pStyle w:val="Corpsdetexte"/>
         <w:bidi w:val="0"/>
         <w:jc w:val="left"/>
         <w:rPr/>
@@ -289,7 +317,8 @@
           </w:tcPr>
           <w:p>
             <w:pPr>
-              <w:pStyle w:val="BodyText"/>
+              <w:pStyle w:val="Corpsdetexte"/>
+              <w:widowControl w:val="false"/>
               <w:bidi w:val="0"/>
               <w:spacing w:before="0" w:after="140"/>
               <w:jc w:val="left"/>
@@ -301,7 +330,7 @@
             </w:r>
             <w:r>
               <w:rPr>
-                <w:rFonts w:cs="" w:asciiTheme="minorHAnsi" w:cstheme="minorHAnsi" w:hAnsiTheme="minorHAnsi"/>
+                <w:rFonts w:cs="Arial" w:ascii="Arial" w:hAnsi="Arial" w:asciiTheme="minorHAnsi" w:cstheme="minorHAnsi" w:hAnsiTheme="minorHAnsi"/>
                 <w:sz w:val="20"/>
                 <w:szCs w:val="20"/>
               </w:rPr>
@@ -317,21 +346,21 @@
     </w:tbl>
     <w:p>
       <w:pPr>
-        <w:pStyle w:val="BodyText"/>
-        <w:bidi w:val="0"/>
-        <w:jc w:val="left"/>
-        <w:rPr/>
-      </w:pPr>
-      <w:r>
-        <w:rPr/>
-      </w:r>
-    </w:p>
-    <w:p>
-      <w:pPr>
-        <w:pStyle w:val="Heading4"/>
+        <w:pStyle w:val="Corpsdetexte"/>
+        <w:bidi w:val="0"/>
+        <w:jc w:val="left"/>
+        <w:rPr/>
+      </w:pPr>
+      <w:r>
+        <w:rPr/>
+      </w:r>
+    </w:p>
+    <w:p>
+      <w:pPr>
+        <w:pStyle w:val="Titre4"/>
         <w:numPr>
           <w:ilvl w:val="3"/>
-          <w:numId w:val="2"/>
+          <w:numId w:val="1"/>
         </w:numPr>
         <w:bidi w:val="0"/>
         <w:jc w:val="center"/>
@@ -344,18 +373,18 @@
     </w:p>
     <w:p>
       <w:pPr>
-        <w:pStyle w:val="Lignehorizontaleuser"/>
-        <w:bidi w:val="0"/>
-        <w:jc w:val="left"/>
-        <w:rPr/>
-      </w:pPr>
-      <w:r>
-        <w:rPr/>
-      </w:r>
-    </w:p>
-    <w:p>
-      <w:pPr>
-        <w:pStyle w:val="BodyText"/>
+        <w:pStyle w:val="Lignehorizontale"/>
+        <w:bidi w:val="0"/>
+        <w:jc w:val="left"/>
+        <w:rPr/>
+      </w:pPr>
+      <w:r>
+        <w:rPr/>
+      </w:r>
+    </w:p>
+    <w:p>
+      <w:pPr>
+        <w:pStyle w:val="Corpsdetexte"/>
         <w:bidi w:val="0"/>
         <w:spacing w:before="0" w:after="140"/>
         <w:jc w:val="left"/>
@@ -367,7 +396,7 @@
       </w:r>
       <w:r>
         <w:rPr>
-          <w:rFonts w:cs="" w:asciiTheme="minorHAnsi" w:cstheme="minorHAnsi" w:hAnsiTheme="minorHAnsi"/>
+          <w:rFonts w:cs="Arial" w:ascii="Arial" w:hAnsi="Arial" w:asciiTheme="minorHAnsi" w:cstheme="minorHAnsi" w:hAnsiTheme="minorHAnsi"/>
           <w:sz w:val="20"/>
           <w:szCs w:val="20"/>
         </w:rPr>
@@ -380,7 +409,7 @@
     </w:p>
     <w:p>
       <w:pPr>
-        <w:pStyle w:val="BodyText"/>
+        <w:pStyle w:val="Corpsdetexte"/>
         <w:bidi w:val="0"/>
         <w:spacing w:before="0" w:after="140"/>
         <w:jc w:val="left"/>
@@ -392,7 +421,7 @@
       </w:r>
       <w:r>
         <w:rPr>
-          <w:rFonts w:cs="" w:asciiTheme="minorHAnsi" w:cstheme="minorHAnsi" w:hAnsiTheme="minorHAnsi"/>
+          <w:rFonts w:cs="Arial" w:ascii="Arial" w:hAnsi="Arial" w:asciiTheme="minorHAnsi" w:cstheme="minorHAnsi" w:hAnsiTheme="minorHAnsi"/>
           <w:sz w:val="20"/>
           <w:szCs w:val="20"/>
         </w:rPr>
@@ -405,7 +434,7 @@
     </w:p>
     <w:p>
       <w:pPr>
-        <w:pStyle w:val="BodyText"/>
+        <w:pStyle w:val="Corpsdetexte"/>
         <w:bidi w:val="0"/>
         <w:spacing w:before="0" w:after="140"/>
         <w:jc w:val="left"/>
@@ -417,7 +446,7 @@
       </w:r>
       <w:r>
         <w:rPr>
-          <w:rFonts w:cs="" w:asciiTheme="minorHAnsi" w:cstheme="minorHAnsi" w:hAnsiTheme="minorHAnsi"/>
+          <w:rFonts w:cs="Arial" w:ascii="Arial" w:hAnsi="Arial" w:asciiTheme="minorHAnsi" w:cstheme="minorHAnsi" w:hAnsiTheme="minorHAnsi"/>
           <w:sz w:val="20"/>
           <w:szCs w:val="20"/>
         </w:rPr>
@@ -430,7 +459,7 @@
     </w:p>
     <w:p>
       <w:pPr>
-        <w:pStyle w:val="BodyText"/>
+        <w:pStyle w:val="Corpsdetexte"/>
         <w:bidi w:val="0"/>
         <w:spacing w:before="0" w:after="140"/>
         <w:jc w:val="left"/>
@@ -442,7 +471,7 @@
       </w:r>
       <w:r>
         <w:rPr>
-          <w:rFonts w:cs="" w:asciiTheme="minorHAnsi" w:cstheme="minorHAnsi" w:hAnsiTheme="minorHAnsi"/>
+          <w:rFonts w:cs="Arial" w:ascii="Arial" w:hAnsi="Arial" w:asciiTheme="minorHAnsi" w:cstheme="minorHAnsi" w:hAnsiTheme="minorHAnsi"/>
           <w:sz w:val="20"/>
           <w:szCs w:val="20"/>
         </w:rPr>
@@ -455,7 +484,7 @@
     </w:p>
     <w:p>
       <w:pPr>
-        <w:pStyle w:val="BodyText"/>
+        <w:pStyle w:val="Corpsdetexte"/>
         <w:bidi w:val="0"/>
         <w:spacing w:before="0" w:after="140"/>
         <w:jc w:val="left"/>
@@ -467,7 +496,7 @@
       </w:r>
       <w:r>
         <w:rPr>
-          <w:rFonts w:cs="" w:asciiTheme="minorHAnsi" w:cstheme="minorHAnsi" w:hAnsiTheme="minorHAnsi"/>
+          <w:rFonts w:cs="Arial" w:ascii="Arial" w:hAnsi="Arial" w:asciiTheme="minorHAnsi" w:cstheme="minorHAnsi" w:hAnsiTheme="minorHAnsi"/>
           <w:sz w:val="20"/>
           <w:szCs w:val="20"/>
         </w:rPr>
@@ -480,7 +509,7 @@
     </w:p>
     <w:p>
       <w:pPr>
-        <w:pStyle w:val="BodyText"/>
+        <w:pStyle w:val="Corpsdetexte"/>
         <w:bidi w:val="0"/>
         <w:spacing w:before="0" w:after="140"/>
         <w:jc w:val="left"/>
@@ -492,7 +521,7 @@
       </w:r>
       <w:r>
         <w:rPr>
-          <w:rFonts w:cs="" w:asciiTheme="minorHAnsi" w:cstheme="minorHAnsi" w:hAnsiTheme="minorHAnsi"/>
+          <w:rFonts w:cs="Arial" w:ascii="Arial" w:hAnsi="Arial" w:asciiTheme="minorHAnsi" w:cstheme="minorHAnsi" w:hAnsiTheme="minorHAnsi"/>
           <w:sz w:val="20"/>
           <w:szCs w:val="20"/>
         </w:rPr>
@@ -505,7 +534,7 @@
     </w:p>
     <w:p>
       <w:pPr>
-        <w:pStyle w:val="BodyText"/>
+        <w:pStyle w:val="Corpsdetexte"/>
         <w:bidi w:val="0"/>
         <w:spacing w:before="0" w:after="140"/>
         <w:jc w:val="left"/>
@@ -517,10 +546,10 @@
     </w:p>
     <w:p>
       <w:pPr>
-        <w:pStyle w:val="Heading4"/>
+        <w:pStyle w:val="Titre4"/>
         <w:numPr>
           <w:ilvl w:val="3"/>
-          <w:numId w:val="2"/>
+          <w:numId w:val="1"/>
         </w:numPr>
         <w:bidi w:val="0"/>
         <w:jc w:val="center"/>
@@ -533,18 +562,18 @@
     </w:p>
     <w:p>
       <w:pPr>
-        <w:pStyle w:val="Lignehorizontaleuser"/>
-        <w:bidi w:val="0"/>
-        <w:jc w:val="left"/>
-        <w:rPr/>
-      </w:pPr>
-      <w:r>
-        <w:rPr/>
-      </w:r>
-    </w:p>
-    <w:p>
-      <w:pPr>
-        <w:pStyle w:val="BodyText"/>
+        <w:pStyle w:val="Lignehorizontale"/>
+        <w:bidi w:val="0"/>
+        <w:jc w:val="left"/>
+        <w:rPr/>
+      </w:pPr>
+      <w:r>
+        <w:rPr/>
+      </w:r>
+    </w:p>
+    <w:p>
+      <w:pPr>
+        <w:pStyle w:val="Corpsdetexte"/>
         <w:bidi w:val="0"/>
         <w:spacing w:before="0" w:after="140"/>
         <w:jc w:val="left"/>
@@ -556,7 +585,7 @@
       </w:r>
       <w:r>
         <w:rPr>
-          <w:rFonts w:cs="" w:asciiTheme="minorHAnsi" w:cstheme="minorHAnsi" w:hAnsiTheme="minorHAnsi"/>
+          <w:rFonts w:cs="Arial" w:ascii="Arial" w:hAnsi="Arial" w:asciiTheme="minorHAnsi" w:cstheme="minorHAnsi" w:hAnsiTheme="minorHAnsi"/>
           <w:sz w:val="20"/>
           <w:szCs w:val="20"/>
         </w:rPr>
@@ -569,7 +598,7 @@
     </w:p>
     <w:p>
       <w:pPr>
-        <w:pStyle w:val="BodyText"/>
+        <w:pStyle w:val="Corpsdetexte"/>
         <w:bidi w:val="0"/>
         <w:spacing w:before="0" w:after="140"/>
         <w:jc w:val="left"/>
@@ -581,7 +610,7 @@
       </w:r>
       <w:r>
         <w:rPr>
-          <w:rFonts w:cs="" w:asciiTheme="minorHAnsi" w:cstheme="minorHAnsi" w:hAnsiTheme="minorHAnsi"/>
+          <w:rFonts w:cs="Arial" w:ascii="Arial" w:hAnsi="Arial" w:asciiTheme="minorHAnsi" w:cstheme="minorHAnsi" w:hAnsiTheme="minorHAnsi"/>
           <w:sz w:val="20"/>
           <w:szCs w:val="20"/>
         </w:rPr>
@@ -594,7 +623,7 @@
     </w:p>
     <w:p>
       <w:pPr>
-        <w:pStyle w:val="BodyText"/>
+        <w:pStyle w:val="Corpsdetexte"/>
         <w:bidi w:val="0"/>
         <w:spacing w:before="0" w:after="140"/>
         <w:jc w:val="left"/>
@@ -606,7 +635,7 @@
       </w:r>
       <w:r>
         <w:rPr>
-          <w:rFonts w:cs="" w:asciiTheme="minorHAnsi" w:cstheme="minorHAnsi" w:hAnsiTheme="minorHAnsi"/>
+          <w:rFonts w:cs="Arial" w:ascii="Arial" w:hAnsi="Arial" w:asciiTheme="minorHAnsi" w:cstheme="minorHAnsi" w:hAnsiTheme="minorHAnsi"/>
           <w:sz w:val="20"/>
           <w:szCs w:val="20"/>
         </w:rPr>
@@ -618,7 +647,7 @@
       </w:r>
       <w:r>
         <w:rPr>
-          <w:rFonts w:cs="" w:asciiTheme="minorHAnsi" w:cstheme="minorHAnsi" w:hAnsiTheme="minorHAnsi"/>
+          <w:rFonts w:cs="Arial" w:ascii="Arial" w:hAnsi="Arial" w:asciiTheme="minorHAnsi" w:cstheme="minorHAnsi" w:hAnsiTheme="minorHAnsi"/>
           <w:sz w:val="20"/>
           <w:szCs w:val="20"/>
         </w:rPr>
@@ -631,7 +660,7 @@
     </w:p>
     <w:p>
       <w:pPr>
-        <w:pStyle w:val="BodyText"/>
+        <w:pStyle w:val="Corpsdetexte"/>
         <w:bidi w:val="0"/>
         <w:spacing w:before="0" w:after="140"/>
         <w:jc w:val="left"/>
@@ -643,7 +672,7 @@
       </w:r>
       <w:r>
         <w:rPr>
-          <w:rFonts w:cs="" w:asciiTheme="minorHAnsi" w:cstheme="minorHAnsi" w:hAnsiTheme="minorHAnsi"/>
+          <w:rFonts w:cs="Arial" w:ascii="Arial" w:hAnsi="Arial" w:asciiTheme="minorHAnsi" w:cstheme="minorHAnsi" w:hAnsiTheme="minorHAnsi"/>
           <w:sz w:val="20"/>
           <w:szCs w:val="20"/>
         </w:rPr>
@@ -656,7 +685,7 @@
     </w:p>
     <w:p>
       <w:pPr>
-        <w:pStyle w:val="BodyText"/>
+        <w:pStyle w:val="Corpsdetexte"/>
         <w:bidi w:val="0"/>
         <w:spacing w:before="0" w:after="140"/>
         <w:jc w:val="left"/>
@@ -679,7 +708,7 @@
       </w:r>
       <w:r>
         <w:rPr>
-          <w:rFonts w:eastAsia="Noto Serif CJK SC" w:cs="" w:asciiTheme="minorHAnsi" w:cstheme="minorHAnsi" w:hAnsiTheme="minorHAnsi"/>
+          <w:rFonts w:eastAsia="Noto Serif CJK SC" w:cs="Arial" w:ascii="Arial" w:hAnsi="Arial" w:asciiTheme="minorHAnsi" w:cstheme="minorHAnsi" w:hAnsiTheme="minorHAnsi"/>
           <w:color w:val="auto"/>
           <w:kern w:val="2"/>
           <w:sz w:val="20"/>
@@ -702,7 +731,7 @@
     </w:p>
     <w:p>
       <w:pPr>
-        <w:pStyle w:val="BodyText"/>
+        <w:pStyle w:val="Corpsdetexte"/>
         <w:bidi w:val="0"/>
         <w:spacing w:before="0" w:after="140"/>
         <w:jc w:val="left"/>
@@ -721,7 +750,7 @@
       </w:r>
       <w:r>
         <w:rPr>
-          <w:rFonts w:eastAsia="Noto Serif CJK SC" w:cs="" w:asciiTheme="minorHAnsi" w:cstheme="minorHAnsi" w:hAnsiTheme="minorHAnsi"/>
+          <w:rFonts w:eastAsia="Noto Serif CJK SC" w:cs="Arial" w:ascii="Arial" w:hAnsi="Arial" w:asciiTheme="minorHAnsi" w:cstheme="minorHAnsi" w:hAnsiTheme="minorHAnsi"/>
           <w:color w:val="auto"/>
           <w:kern w:val="2"/>
           <w:sz w:val="20"/>
@@ -744,7 +773,7 @@
     </w:p>
     <w:p>
       <w:pPr>
-        <w:pStyle w:val="BodyText"/>
+        <w:pStyle w:val="Corpsdetexte"/>
         <w:bidi w:val="0"/>
         <w:spacing w:before="0" w:after="140"/>
         <w:jc w:val="left"/>
@@ -763,7 +792,7 @@
       </w:r>
       <w:r>
         <w:rPr>
-          <w:rFonts w:eastAsia="Noto Serif CJK SC" w:cs="" w:asciiTheme="minorHAnsi" w:cstheme="minorHAnsi" w:hAnsiTheme="minorHAnsi"/>
+          <w:rFonts w:eastAsia="Noto Serif CJK SC" w:cs="Arial" w:ascii="Arial" w:hAnsi="Arial" w:asciiTheme="minorHAnsi" w:cstheme="minorHAnsi" w:hAnsiTheme="minorHAnsi"/>
           <w:color w:val="auto"/>
           <w:kern w:val="2"/>
           <w:sz w:val="20"/>
@@ -786,10 +815,10 @@
     </w:p>
     <w:p>
       <w:pPr>
-        <w:pStyle w:val="Heading4"/>
+        <w:pStyle w:val="Titre4"/>
         <w:numPr>
           <w:ilvl w:val="3"/>
-          <w:numId w:val="2"/>
+          <w:numId w:val="1"/>
         </w:numPr>
         <w:bidi w:val="0"/>
         <w:jc w:val="center"/>
@@ -802,18 +831,18 @@
     </w:p>
     <w:p>
       <w:pPr>
-        <w:pStyle w:val="Lignehorizontaleuser"/>
-        <w:bidi w:val="0"/>
-        <w:jc w:val="left"/>
-        <w:rPr/>
-      </w:pPr>
-      <w:r>
-        <w:rPr/>
-      </w:r>
-    </w:p>
-    <w:p>
-      <w:pPr>
-        <w:pStyle w:val="BodyText"/>
+        <w:pStyle w:val="Lignehorizontale"/>
+        <w:bidi w:val="0"/>
+        <w:jc w:val="left"/>
+        <w:rPr/>
+      </w:pPr>
+      <w:r>
+        <w:rPr/>
+      </w:r>
+    </w:p>
+    <w:p>
+      <w:pPr>
+        <w:pStyle w:val="Corpsdetexte"/>
         <w:bidi w:val="0"/>
         <w:spacing w:before="0" w:after="140"/>
         <w:jc w:val="left"/>
@@ -832,7 +861,7 @@
       </w:r>
       <w:r>
         <w:rPr>
-          <w:rFonts w:eastAsia="Noto Serif CJK SC" w:cs="" w:asciiTheme="minorHAnsi" w:cstheme="minorHAnsi" w:hAnsiTheme="minorHAnsi"/>
+          <w:rFonts w:eastAsia="Noto Serif CJK SC" w:cs="Arial" w:ascii="Arial" w:hAnsi="Arial" w:asciiTheme="minorHAnsi" w:cstheme="minorHAnsi" w:hAnsiTheme="minorHAnsi"/>
           <w:color w:val="auto"/>
           <w:kern w:val="2"/>
           <w:sz w:val="20"/>
@@ -855,7 +884,7 @@
     </w:p>
     <w:p>
       <w:pPr>
-        <w:pStyle w:val="BodyText"/>
+        <w:pStyle w:val="Corpsdetexte"/>
         <w:bidi w:val="0"/>
         <w:spacing w:before="0" w:after="140"/>
         <w:jc w:val="left"/>
@@ -881,10 +910,10 @@
     </w:p>
     <w:p>
       <w:pPr>
-        <w:pStyle w:val="Heading4"/>
+        <w:pStyle w:val="Titre4"/>
         <w:numPr>
           <w:ilvl w:val="3"/>
-          <w:numId w:val="2"/>
+          <w:numId w:val="1"/>
         </w:numPr>
         <w:bidi w:val="0"/>
         <w:jc w:val="center"/>
@@ -897,18 +926,18 @@
     </w:p>
     <w:p>
       <w:pPr>
-        <w:pStyle w:val="Lignehorizontaleuser"/>
-        <w:bidi w:val="0"/>
-        <w:jc w:val="left"/>
-        <w:rPr/>
-      </w:pPr>
-      <w:r>
-        <w:rPr/>
-      </w:r>
-    </w:p>
-    <w:p>
-      <w:pPr>
-        <w:pStyle w:val="BodyText"/>
+        <w:pStyle w:val="Lignehorizontale"/>
+        <w:bidi w:val="0"/>
+        <w:jc w:val="left"/>
+        <w:rPr/>
+      </w:pPr>
+      <w:r>
+        <w:rPr/>
+      </w:r>
+    </w:p>
+    <w:p>
+      <w:pPr>
+        <w:pStyle w:val="Corpsdetexte"/>
         <w:rPr/>
       </w:pPr>
       <w:r>
@@ -918,7 +947,7 @@
     </w:p>
     <w:p>
       <w:pPr>
-        <w:pStyle w:val="BodyText"/>
+        <w:pStyle w:val="Corpsdetexte"/>
         <w:rPr/>
       </w:pPr>
       <w:r>
@@ -928,7 +957,7 @@
     </w:p>
     <w:p>
       <w:pPr>
-        <w:pStyle w:val="BodyText"/>
+        <w:pStyle w:val="Corpsdetexte"/>
         <w:rPr/>
       </w:pPr>
       <w:r>
@@ -938,19 +967,19 @@
     </w:p>
     <w:p>
       <w:pPr>
-        <w:pStyle w:val="BodyText"/>
-        <w:rPr/>
-      </w:pPr>
-      <w:r>
-        <w:rPr/>
-      </w:r>
-    </w:p>
-    <w:p>
-      <w:pPr>
-        <w:pStyle w:val="Heading4"/>
+        <w:pStyle w:val="Corpsdetexte"/>
+        <w:rPr/>
+      </w:pPr>
+      <w:r>
+        <w:rPr/>
+      </w:r>
+    </w:p>
+    <w:p>
+      <w:pPr>
+        <w:pStyle w:val="Titre4"/>
         <w:numPr>
           <w:ilvl w:val="3"/>
-          <w:numId w:val="2"/>
+          <w:numId w:val="1"/>
         </w:numPr>
         <w:bidi w:val="0"/>
         <w:jc w:val="center"/>
@@ -963,18 +992,18 @@
     </w:p>
     <w:p>
       <w:pPr>
-        <w:pStyle w:val="Lignehorizontaleuser"/>
-        <w:bidi w:val="0"/>
-        <w:jc w:val="left"/>
-        <w:rPr/>
-      </w:pPr>
-      <w:r>
-        <w:rPr/>
-      </w:r>
-    </w:p>
-    <w:p>
-      <w:pPr>
-        <w:pStyle w:val="BodyText"/>
+        <w:pStyle w:val="Lignehorizontale"/>
+        <w:bidi w:val="0"/>
+        <w:jc w:val="left"/>
+        <w:rPr/>
+      </w:pPr>
+      <w:r>
+        <w:rPr/>
+      </w:r>
+    </w:p>
+    <w:p>
+      <w:pPr>
+        <w:pStyle w:val="Corpsdetexte"/>
         <w:rPr/>
       </w:pPr>
       <w:r>
@@ -984,7 +1013,7 @@
     </w:p>
     <w:p>
       <w:pPr>
-        <w:pStyle w:val="BodyText"/>
+        <w:pStyle w:val="Corpsdetexte"/>
         <w:rPr/>
       </w:pPr>
       <w:r>
@@ -994,7 +1023,7 @@
     </w:p>
     <w:p>
       <w:pPr>
-        <w:pStyle w:val="BodyText"/>
+        <w:pStyle w:val="Corpsdetexte"/>
         <w:rPr/>
       </w:pPr>
       <w:r>
@@ -1003,7 +1032,7 @@
       </w:r>
       <w:r>
         <w:rPr>
-          <w:rFonts w:cs="" w:asciiTheme="minorHAnsi" w:cstheme="minorHAnsi" w:hAnsiTheme="minorHAnsi"/>
+          <w:rFonts w:cs="Arial" w:ascii="Arial" w:hAnsi="Arial" w:asciiTheme="minorHAnsi" w:cstheme="minorHAnsi" w:hAnsiTheme="minorHAnsi"/>
           <w:sz w:val="20"/>
           <w:szCs w:val="20"/>
         </w:rPr>
@@ -1016,7 +1045,7 @@
     </w:p>
     <w:p>
       <w:pPr>
-        <w:pStyle w:val="BodyText"/>
+        <w:pStyle w:val="Corpsdetexte"/>
         <w:rPr/>
       </w:pPr>
       <w:r>
@@ -1025,7 +1054,7 @@
       </w:r>
       <w:r>
         <w:rPr>
-          <w:rFonts w:cs="" w:asciiTheme="minorHAnsi" w:cstheme="minorHAnsi" w:hAnsiTheme="minorHAnsi"/>
+          <w:rFonts w:cs="Arial" w:ascii="Arial" w:hAnsi="Arial" w:asciiTheme="minorHAnsi" w:cstheme="minorHAnsi" w:hAnsiTheme="minorHAnsi"/>
           <w:sz w:val="20"/>
           <w:szCs w:val="20"/>
         </w:rPr>
@@ -1038,7 +1067,7 @@
     </w:p>
     <w:p>
       <w:pPr>
-        <w:pStyle w:val="BodyText"/>
+        <w:pStyle w:val="Corpsdetexte"/>
         <w:rPr/>
       </w:pPr>
       <w:r>
@@ -1047,7 +1076,7 @@
       </w:r>
       <w:r>
         <w:rPr>
-          <w:rFonts w:cs="" w:asciiTheme="minorHAnsi" w:cstheme="minorHAnsi" w:hAnsiTheme="minorHAnsi"/>
+          <w:rFonts w:cs="Arial" w:ascii="Arial" w:hAnsi="Arial" w:asciiTheme="minorHAnsi" w:cstheme="minorHAnsi" w:hAnsiTheme="minorHAnsi"/>
           <w:sz w:val="20"/>
           <w:szCs w:val="20"/>
         </w:rPr>
@@ -1060,7 +1089,7 @@
     </w:p>
     <w:p>
       <w:pPr>
-        <w:pStyle w:val="BodyText"/>
+        <w:pStyle w:val="Corpsdetexte"/>
         <w:rPr/>
       </w:pPr>
       <w:r>
@@ -1069,7 +1098,7 @@
       </w:r>
       <w:r>
         <w:rPr>
-          <w:rFonts w:cs="" w:asciiTheme="minorHAnsi" w:cstheme="minorHAnsi" w:hAnsiTheme="minorHAnsi"/>
+          <w:rFonts w:cs="Arial" w:ascii="Arial" w:hAnsi="Arial" w:asciiTheme="minorHAnsi" w:cstheme="minorHAnsi" w:hAnsiTheme="minorHAnsi"/>
           <w:sz w:val="20"/>
           <w:szCs w:val="20"/>
         </w:rPr>
@@ -1082,7 +1111,7 @@
     </w:p>
     <w:p>
       <w:pPr>
-        <w:pStyle w:val="BodyText"/>
+        <w:pStyle w:val="Corpsdetexte"/>
         <w:rPr/>
       </w:pPr>
       <w:r>
@@ -1091,7 +1120,7 @@
       </w:r>
       <w:r>
         <w:rPr>
-          <w:rFonts w:cs="" w:asciiTheme="minorHAnsi" w:cstheme="minorHAnsi" w:hAnsiTheme="minorHAnsi"/>
+          <w:rFonts w:cs="Arial" w:ascii="Arial" w:hAnsi="Arial" w:asciiTheme="minorHAnsi" w:cstheme="minorHAnsi" w:hAnsiTheme="minorHAnsi"/>
           <w:sz w:val="20"/>
           <w:szCs w:val="20"/>
         </w:rPr>
@@ -1104,7 +1133,7 @@
     </w:p>
     <w:p>
       <w:pPr>
-        <w:pStyle w:val="BodyText"/>
+        <w:pStyle w:val="Corpsdetexte"/>
         <w:rPr/>
       </w:pPr>
       <w:r>
@@ -1113,7 +1142,7 @@
       </w:r>
       <w:r>
         <w:rPr>
-          <w:rFonts w:cs="" w:asciiTheme="minorHAnsi" w:cstheme="minorHAnsi" w:hAnsiTheme="minorHAnsi"/>
+          <w:rFonts w:cs="Arial" w:ascii="Arial" w:hAnsi="Arial" w:asciiTheme="minorHAnsi" w:cstheme="minorHAnsi" w:hAnsiTheme="minorHAnsi"/>
           <w:sz w:val="20"/>
           <w:szCs w:val="20"/>
         </w:rPr>
@@ -1126,7 +1155,7 @@
     </w:p>
     <w:p>
       <w:pPr>
-        <w:pStyle w:val="BodyText"/>
+        <w:pStyle w:val="Corpsdetexte"/>
         <w:rPr/>
       </w:pPr>
       <w:r>
@@ -1135,7 +1164,7 @@
       </w:r>
       <w:r>
         <w:rPr>
-          <w:rFonts w:cs="" w:asciiTheme="minorHAnsi" w:cstheme="minorHAnsi" w:hAnsiTheme="minorHAnsi"/>
+          <w:rFonts w:cs="Arial" w:ascii="Arial" w:hAnsi="Arial" w:asciiTheme="minorHAnsi" w:cstheme="minorHAnsi" w:hAnsiTheme="minorHAnsi"/>
           <w:sz w:val="20"/>
           <w:szCs w:val="20"/>
         </w:rPr>
@@ -1148,7 +1177,7 @@
     </w:p>
     <w:p>
       <w:pPr>
-        <w:pStyle w:val="BodyText"/>
+        <w:pStyle w:val="Corpsdetexte"/>
         <w:rPr/>
       </w:pPr>
       <w:r>
@@ -1157,7 +1186,7 @@
       </w:r>
       <w:r>
         <w:rPr>
-          <w:rFonts w:cs="" w:asciiTheme="minorHAnsi" w:cstheme="minorHAnsi" w:hAnsiTheme="minorHAnsi"/>
+          <w:rFonts w:cs="Arial" w:ascii="Arial" w:hAnsi="Arial" w:asciiTheme="minorHAnsi" w:cstheme="minorHAnsi" w:hAnsiTheme="minorHAnsi"/>
           <w:sz w:val="20"/>
           <w:szCs w:val="20"/>
         </w:rPr>
@@ -1170,7 +1199,7 @@
     </w:p>
     <w:p>
       <w:pPr>
-        <w:pStyle w:val="BodyText"/>
+        <w:pStyle w:val="Corpsdetexte"/>
         <w:rPr/>
       </w:pPr>
       <w:r>
@@ -1179,7 +1208,7 @@
       </w:r>
       <w:r>
         <w:rPr>
-          <w:rFonts w:cs="" w:asciiTheme="minorHAnsi" w:cstheme="minorHAnsi" w:hAnsiTheme="minorHAnsi"/>
+          <w:rFonts w:cs="Arial" w:ascii="Arial" w:hAnsi="Arial" w:asciiTheme="minorHAnsi" w:cstheme="minorHAnsi" w:hAnsiTheme="minorHAnsi"/>
           <w:sz w:val="20"/>
           <w:szCs w:val="20"/>
         </w:rPr>
@@ -1192,7 +1221,7 @@
     </w:p>
     <w:p>
       <w:pPr>
-        <w:pStyle w:val="BodyText"/>
+        <w:pStyle w:val="Corpsdetexte"/>
         <w:rPr/>
       </w:pPr>
       <w:r>
@@ -1201,7 +1230,7 @@
       </w:r>
       <w:r>
         <w:rPr>
-          <w:rFonts w:cs="" w:asciiTheme="minorHAnsi" w:cstheme="minorHAnsi" w:hAnsiTheme="minorHAnsi"/>
+          <w:rFonts w:cs="Arial" w:ascii="Arial" w:hAnsi="Arial" w:asciiTheme="minorHAnsi" w:cstheme="minorHAnsi" w:hAnsiTheme="minorHAnsi"/>
           <w:sz w:val="20"/>
           <w:szCs w:val="20"/>
         </w:rPr>
@@ -1214,7 +1243,7 @@
     </w:p>
     <w:p>
       <w:pPr>
-        <w:pStyle w:val="BodyText"/>
+        <w:pStyle w:val="Corpsdetexte"/>
         <w:rPr/>
       </w:pPr>
       <w:r>
@@ -1223,7 +1252,7 @@
       </w:r>
       <w:r>
         <w:rPr>
-          <w:rFonts w:cs="" w:asciiTheme="minorHAnsi" w:cstheme="minorHAnsi" w:hAnsiTheme="minorHAnsi"/>
+          <w:rFonts w:cs="Arial" w:ascii="Arial" w:hAnsi="Arial" w:asciiTheme="minorHAnsi" w:cstheme="minorHAnsi" w:hAnsiTheme="minorHAnsi"/>
           <w:sz w:val="20"/>
           <w:szCs w:val="20"/>
         </w:rPr>
@@ -1245,7 +1274,7 @@
     </w:p>
     <w:p>
       <w:pPr>
-        <w:pStyle w:val="BodyText"/>
+        <w:pStyle w:val="Corpsdetexte"/>
         <w:rPr/>
       </w:pPr>
       <w:r>
@@ -1255,7 +1284,7 @@
     </w:p>
     <w:p>
       <w:pPr>
-        <w:pStyle w:val="BodyText"/>
+        <w:pStyle w:val="Corpsdetexte"/>
         <w:bidi w:val="0"/>
         <w:spacing w:before="0" w:after="140"/>
         <w:jc w:val="left"/>
@@ -1281,10 +1310,10 @@
     </w:p>
     <w:p>
       <w:pPr>
-        <w:pStyle w:val="Heading4"/>
+        <w:pStyle w:val="Titre4"/>
         <w:numPr>
           <w:ilvl w:val="3"/>
-          <w:numId w:val="2"/>
+          <w:numId w:val="1"/>
         </w:numPr>
         <w:bidi w:val="0"/>
         <w:jc w:val="center"/>
@@ -1297,18 +1326,18 @@
     </w:p>
     <w:p>
       <w:pPr>
-        <w:pStyle w:val="Lignehorizontaleuser"/>
-        <w:bidi w:val="0"/>
-        <w:jc w:val="left"/>
-        <w:rPr/>
-      </w:pPr>
-      <w:r>
-        <w:rPr/>
-      </w:r>
-    </w:p>
-    <w:p>
-      <w:pPr>
-        <w:pStyle w:val="BodyText"/>
+        <w:pStyle w:val="Lignehorizontale"/>
+        <w:bidi w:val="0"/>
+        <w:jc w:val="left"/>
+        <w:rPr/>
+      </w:pPr>
+      <w:r>
+        <w:rPr/>
+      </w:r>
+    </w:p>
+    <w:p>
+      <w:pPr>
+        <w:pStyle w:val="Corpsdetexte"/>
         <w:rPr/>
       </w:pPr>
       <w:r>
@@ -1318,7 +1347,7 @@
     </w:p>
     <w:p>
       <w:pPr>
-        <w:pStyle w:val="BodyText"/>
+        <w:pStyle w:val="Corpsdetexte"/>
         <w:rPr/>
       </w:pPr>
       <w:r>
@@ -1328,8 +1357,6 @@
     </w:p>
     <w:p>
       <w:pPr>
-        <w:pStyle w:val="BodyText"/>
-        <w:rPr/>
         <w:sectPr>
           <w:type w:val="nextPage"/>
           <w:pgSz w:w="11906" w:h="16838"/>
@@ -1339,6 +1366,8 @@
           <w:textDirection w:val="lrTb"/>
           <w:docGrid w:type="default" w:linePitch="100" w:charSpace="0"/>
         </w:sectPr>
+        <w:pStyle w:val="Corpsdetexte"/>
+        <w:rPr/>
       </w:pPr>
       <w:r>
         <w:rPr/>
@@ -1347,10 +1376,10 @@
     </w:p>
     <w:p>
       <w:pPr>
-        <w:pStyle w:val="Heading4"/>
+        <w:pStyle w:val="Titre4"/>
         <w:numPr>
           <w:ilvl w:val="3"/>
-          <w:numId w:val="2"/>
+          <w:numId w:val="1"/>
         </w:numPr>
         <w:bidi w:val="0"/>
         <w:spacing w:before="0" w:after="140"/>
@@ -1371,7 +1400,7 @@
     </w:p>
     <w:p>
       <w:pPr>
-        <w:pStyle w:val="Lignehorizontaleuser"/>
+        <w:pStyle w:val="Lignehorizontale"/>
         <w:rPr>
           <w:rFonts w:ascii="Liberation Serif" w:hAnsi="Liberation Serif" w:eastAsia="Noto Serif CJK SC" w:cs="Lohit Devanagari"/>
           <w:color w:val="auto"/>
@@ -1439,6 +1468,7 @@
         </w:tabs>
         <w:ind w:left="0" w:hanging="0"/>
       </w:pPr>
+      <w:rPr/>
     </w:lvl>
     <w:lvl w:ilvl="1">
       <w:start w:val="1"/>
@@ -1452,6 +1482,7 @@
         </w:tabs>
         <w:ind w:left="0" w:hanging="0"/>
       </w:pPr>
+      <w:rPr/>
     </w:lvl>
     <w:lvl w:ilvl="2">
       <w:start w:val="1"/>
@@ -1465,6 +1496,7 @@
         </w:tabs>
         <w:ind w:left="0" w:hanging="0"/>
       </w:pPr>
+      <w:rPr/>
     </w:lvl>
     <w:lvl w:ilvl="3">
       <w:start w:val="1"/>
@@ -1478,6 +1510,7 @@
         </w:tabs>
         <w:ind w:left="0" w:hanging="0"/>
       </w:pPr>
+      <w:rPr/>
     </w:lvl>
     <w:lvl w:ilvl="4">
       <w:start w:val="1"/>
@@ -1491,6 +1524,7 @@
         </w:tabs>
         <w:ind w:left="0" w:hanging="0"/>
       </w:pPr>
+      <w:rPr/>
     </w:lvl>
     <w:lvl w:ilvl="5">
       <w:start w:val="1"/>
@@ -1504,6 +1538,7 @@
         </w:tabs>
         <w:ind w:left="0" w:hanging="0"/>
       </w:pPr>
+      <w:rPr/>
     </w:lvl>
     <w:lvl w:ilvl="6">
       <w:start w:val="1"/>
@@ -1517,6 +1552,7 @@
         </w:tabs>
         <w:ind w:left="0" w:hanging="0"/>
       </w:pPr>
+      <w:rPr/>
     </w:lvl>
     <w:lvl w:ilvl="7">
       <w:start w:val="1"/>
@@ -1530,6 +1566,7 @@
         </w:tabs>
         <w:ind w:left="0" w:hanging="0"/>
       </w:pPr>
+      <w:rPr/>
     </w:lvl>
     <w:lvl w:ilvl="8">
       <w:start w:val="1"/>
@@ -1543,6 +1580,7 @@
         </w:tabs>
         <w:ind w:left="0" w:hanging="0"/>
       </w:pPr>
+      <w:rPr/>
     </w:lvl>
   </w:abstractNum>
   <w:abstractNum w:abstractNumId="2">
@@ -1558,7 +1596,6 @@
         </w:tabs>
         <w:ind w:left="0" w:hanging="0"/>
       </w:pPr>
-      <w:rPr/>
     </w:lvl>
     <w:lvl w:ilvl="1">
       <w:start w:val="1"/>
@@ -1572,7 +1609,6 @@
         </w:tabs>
         <w:ind w:left="0" w:hanging="0"/>
       </w:pPr>
-      <w:rPr/>
     </w:lvl>
     <w:lvl w:ilvl="2">
       <w:start w:val="1"/>
@@ -1586,7 +1622,6 @@
         </w:tabs>
         <w:ind w:left="0" w:hanging="0"/>
       </w:pPr>
-      <w:rPr/>
     </w:lvl>
     <w:lvl w:ilvl="3">
       <w:start w:val="1"/>
@@ -1600,7 +1635,6 @@
         </w:tabs>
         <w:ind w:left="0" w:hanging="0"/>
       </w:pPr>
-      <w:rPr/>
     </w:lvl>
     <w:lvl w:ilvl="4">
       <w:start w:val="1"/>
@@ -1614,7 +1648,6 @@
         </w:tabs>
         <w:ind w:left="0" w:hanging="0"/>
       </w:pPr>
-      <w:rPr/>
     </w:lvl>
     <w:lvl w:ilvl="5">
       <w:start w:val="1"/>
@@ -1628,7 +1661,6 @@
         </w:tabs>
         <w:ind w:left="0" w:hanging="0"/>
       </w:pPr>
-      <w:rPr/>
     </w:lvl>
     <w:lvl w:ilvl="6">
       <w:start w:val="1"/>
@@ -1642,7 +1674,6 @@
         </w:tabs>
         <w:ind w:left="0" w:hanging="0"/>
       </w:pPr>
-      <w:rPr/>
     </w:lvl>
     <w:lvl w:ilvl="7">
       <w:start w:val="1"/>
@@ -1656,7 +1687,6 @@
         </w:tabs>
         <w:ind w:left="0" w:hanging="0"/>
       </w:pPr>
-      <w:rPr/>
     </w:lvl>
     <w:lvl w:ilvl="8">
       <w:start w:val="1"/>
@@ -1670,7 +1700,6 @@
         </w:tabs>
         <w:ind w:left="0" w:hanging="0"/>
       </w:pPr>
-      <w:rPr/>
     </w:lvl>
   </w:abstractNum>
   <w:num w:numId="1">
@@ -1719,15 +1748,15 @@
       <w:lang w:val="fr-FR" w:eastAsia="zh-CN" w:bidi="hi-IN"/>
     </w:rPr>
   </w:style>
-  <w:style w:type="paragraph" w:styleId="Heading1">
-    <w:name w:val="heading 1"/>
-    <w:basedOn w:val="Titreuser"/>
-    <w:next w:val="BodyText"/>
+  <w:style w:type="paragraph" w:styleId="Titre1">
+    <w:name w:val="Heading 1"/>
+    <w:basedOn w:val="Titre"/>
+    <w:next w:val="Corpsdetexte"/>
     <w:qFormat/>
     <w:pPr>
       <w:numPr>
         <w:ilvl w:val="0"/>
-        <w:numId w:val="2"/>
+        <w:numId w:val="1"/>
       </w:numPr>
       <w:spacing w:before="240" w:after="120"/>
       <w:outlineLvl w:val="0"/>
@@ -1739,15 +1768,15 @@
       <w:szCs w:val="36"/>
     </w:rPr>
   </w:style>
-  <w:style w:type="paragraph" w:styleId="Heading4">
-    <w:name w:val="heading 4"/>
-    <w:basedOn w:val="Titreuser"/>
-    <w:next w:val="BodyText"/>
+  <w:style w:type="paragraph" w:styleId="Titre4">
+    <w:name w:val="Heading 4"/>
+    <w:basedOn w:val="Titre"/>
+    <w:next w:val="Corpsdetexte"/>
     <w:qFormat/>
     <w:pPr>
       <w:numPr>
         <w:ilvl w:val="3"/>
-        <w:numId w:val="2"/>
+        <w:numId w:val="1"/>
       </w:numPr>
       <w:spacing w:before="120" w:after="120"/>
       <w:outlineLvl w:val="3"/>
@@ -1772,19 +1801,19 @@
   <w:style w:type="paragraph" w:styleId="Titre">
     <w:name w:val="Titre"/>
     <w:basedOn w:val="Normal"/>
-    <w:next w:val="BodyText"/>
+    <w:next w:val="Corpsdetexte"/>
     <w:qFormat/>
     <w:pPr>
       <w:keepNext w:val="true"/>
       <w:spacing w:before="240" w:after="120"/>
     </w:pPr>
     <w:rPr>
-      <w:rFonts w:ascii="Liberation Sans" w:hAnsi="Liberation Sans" w:eastAsia="Noto Sans CJK SC" w:cs="Noto Sans Devanagari"/>
+      <w:rFonts w:ascii="Liberation Sans" w:hAnsi="Liberation Sans" w:eastAsia="Noto Sans CJK SC" w:cs="Lohit Devanagari"/>
       <w:sz w:val="28"/>
       <w:szCs w:val="28"/>
     </w:rPr>
   </w:style>
-  <w:style w:type="paragraph" w:styleId="BodyText">
+  <w:style w:type="paragraph" w:styleId="Corpsdetexte">
     <w:name w:val="Body Text"/>
     <w:basedOn w:val="Normal"/>
     <w:pPr>
@@ -1792,16 +1821,16 @@
     </w:pPr>
     <w:rPr/>
   </w:style>
-  <w:style w:type="paragraph" w:styleId="List">
+  <w:style w:type="paragraph" w:styleId="Liste">
     <w:name w:val="List"/>
-    <w:basedOn w:val="BodyText"/>
+    <w:basedOn w:val="Corpsdetexte"/>
     <w:pPr/>
     <w:rPr>
       <w:rFonts w:cs="Lohit Devanagari"/>
     </w:rPr>
   </w:style>
-  <w:style w:type="paragraph" w:styleId="Caption">
-    <w:name w:val="caption"/>
+  <w:style w:type="paragraph" w:styleId="Lgende">
+    <w:name w:val="Caption"/>
     <w:basedOn w:val="Normal"/>
     <w:qFormat/>
     <w:pPr>
@@ -1827,25 +1856,26 @@
       <w:rFonts w:cs="Lohit Devanagari"/>
     </w:rPr>
   </w:style>
-  <w:style w:type="paragraph" w:styleId="Titreuser">
-    <w:name w:val="Titre (user)"/>
+  <w:style w:type="paragraph" w:styleId="Caption">
+    <w:name w:val="caption"/>
     <w:basedOn w:val="Normal"/>
-    <w:next w:val="BodyText"/>
     <w:qFormat/>
     <w:pPr>
-      <w:keepNext w:val="true"/>
-      <w:spacing w:before="240" w:after="120"/>
+      <w:suppressLineNumbers/>
+      <w:spacing w:before="120" w:after="120"/>
     </w:pPr>
     <w:rPr>
-      <w:rFonts w:ascii="Liberation Sans" w:hAnsi="Liberation Sans" w:eastAsia="Noto Sans CJK SC" w:cs="Lohit Devanagari"/>
-      <w:sz w:val="28"/>
-      <w:szCs w:val="28"/>
+      <w:rFonts w:cs="Lohit Devanagari"/>
+      <w:i/>
+      <w:iCs/>
+      <w:sz w:val="24"/>
+      <w:szCs w:val="24"/>
     </w:rPr>
   </w:style>
-  <w:style w:type="paragraph" w:styleId="Title">
+  <w:style w:type="paragraph" w:styleId="Titreprincipal">
     <w:name w:val="Title"/>
-    <w:basedOn w:val="Titreuser"/>
-    <w:next w:val="BodyText"/>
+    <w:basedOn w:val="Titre"/>
+    <w:next w:val="Corpsdetexte"/>
     <w:qFormat/>
     <w:pPr>
       <w:jc w:val="center"/>
@@ -1857,10 +1887,10 @@
       <w:szCs w:val="56"/>
     </w:rPr>
   </w:style>
-  <w:style w:type="paragraph" w:styleId="Lignehorizontaleuser">
-    <w:name w:val="Ligne horizontale (user)"/>
+  <w:style w:type="paragraph" w:styleId="Lignehorizontale">
+    <w:name w:val="Ligne horizontale"/>
     <w:basedOn w:val="Normal"/>
-    <w:next w:val="BodyText"/>
+    <w:next w:val="Corpsdetexte"/>
     <w:qFormat/>
     <w:pPr>
       <w:suppressLineNumbers/>
@@ -1874,8 +1904,8 @@
       <w:szCs w:val="12"/>
     </w:rPr>
   </w:style>
-  <w:style w:type="paragraph" w:styleId="Texteprformatuser">
-    <w:name w:val="Texte préformaté (user)"/>
+  <w:style w:type="paragraph" w:styleId="Texteprformat">
+    <w:name w:val="Texte préformaté"/>
     <w:basedOn w:val="Normal"/>
     <w:qFormat/>
     <w:pPr>
@@ -1889,7 +1919,7 @@
   </w:style>
   <w:style w:type="paragraph" w:styleId="LigneH2">
     <w:name w:val="Ligne H 2"/>
-    <w:basedOn w:val="Lignehorizontaleuser"/>
+    <w:basedOn w:val="Lignehorizontale"/>
     <w:qFormat/>
     <w:pPr>
       <w:pBdr>
@@ -1898,15 +1928,15 @@
     </w:pPr>
     <w:rPr/>
   </w:style>
-  <w:style w:type="paragraph" w:styleId="Contenudecadreuser">
-    <w:name w:val="Contenu de cadre (user)"/>
+  <w:style w:type="paragraph" w:styleId="Contenudecadre">
+    <w:name w:val="Contenu de cadre"/>
     <w:basedOn w:val="Normal"/>
     <w:qFormat/>
     <w:pPr/>
     <w:rPr/>
   </w:style>
-  <w:style w:type="paragraph" w:styleId="Contenudetableauuser">
-    <w:name w:val="Contenu de tableau (user)"/>
+  <w:style w:type="paragraph" w:styleId="Contenudetableau">
+    <w:name w:val="Contenu de tableau"/>
     <w:basedOn w:val="Normal"/>
     <w:qFormat/>
     <w:pPr>

</xml_diff>

<commit_message>
Allow to download docx when no publication date
- Fix the template (add a if on the publication date)
- Add tests
</commit_message>
<xml_diff>
--- a/ssa/doc_templates/evenement_produit.docx
+++ b/ssa/doc_templates/evenement_produit.docx
@@ -160,23 +160,7 @@
       </w:pPr>
       <w:r>
         <w:rPr/>
-        <w:t xml:space="preserve">Date de </w:t>
-      </w:r>
-      <w:r>
-        <w:rPr/>
-        <w:t>publication</w:t>
-      </w:r>
-      <w:r>
-        <w:rPr/>
-        <w:t>: {{object.date_</w:t>
-      </w:r>
-      <w:r>
-        <w:rPr/>
-        <w:t>publication</w:t>
-      </w:r>
-      <w:r>
-        <w:rPr/>
-        <w:t>.strftime("%Y-%m-%d %H:%M") }}</w:t>
+        <w:t>Date de publication: {% if object.date_publication %}{{object.date_publication.strftime("%Y-%m-%d %H:%M") }}{% else %} - {% endif %}</w:t>
       </w:r>
     </w:p>
     <w:p>

</xml_diff>